<commit_message>
build bk3: compile and deploy EPUB/DOCX binaries with optimized chapters
</commit_message>
<xml_diff>
--- a/200_amazon_kdp/03_survival_physics/kdp/handoff/the_moral_physics_of_survival.docx
+++ b/200_amazon_kdp/03_survival_physics/kdp/handoff/the_moral_physics_of_survival.docx
@@ -700,7 +700,101 @@
         <w:pStyle w:val="BodyText"/>
       </w:pPr>
       <w:r>
-        <w:t xml:space="preserve">David Hume noticed something in 1739 that philosophers have been arguing about ever since. Every moral treatise he had read, he wrote, proceeds for a while making ordinary factual claims and then, suddenly, shifts to making normative ones, moving from</w:t>
+        <w:t xml:space="preserve">The outreach worker stood on the concrete and asked Arthur if he wanted a shelter bed. Arthur sat on an overturned plastic crate, his nervous system locked in dorsal-vagal shutdown, and stared at the river without speaking. The worker waited ten seconds. Receiving no verbal response, the worker tapped a button on a municipal tablet. The screen registered the contact outcome as a client decline. A biological collapse had been recorded as an administrative choice. The city had fulfilled its procedural requirement.</w:t>
+      </w:r>
+    </w:p>
+    <w:p>
+      <w:pPr>
+        <w:pStyle w:val="BodyText"/>
+      </w:pPr>
+      <w:r>
+        <w:t xml:space="preserve">David Hume identified the mechanics of this evasion in 1739. Reading through moral treatises, Hume observed that writers consistently begin with descriptive statements about what exists before suddenly shifting to prescriptive statements about what society must do. They move from an observable condition to a moral obligation without explaining the transition. A person suffers on the street. Society should intervene. Hume argued that this transition requires a logical bridge. Without the bridge, the obligation remains unanchored.</w:t>
+      </w:r>
+    </w:p>
+    <w:p>
+      <w:pPr>
+        <w:pStyle w:val="BodyText"/>
+      </w:pPr>
+      <w:r>
+        <w:t xml:space="preserve">The municipal tablet operates within Hume’s gap. The outreach worker observed a physical reality. Arthur remained silent. The system translated this observation into a normative conclusion. Society holds zero further obligation to rescue him. The gap between the physical observation and the moral abandonment was bridged by the assumption that silence equals autonomous refusal.</w:t>
+      </w:r>
+    </w:p>
+    <w:p>
+      <w:pPr>
+        <w:pStyle w:val="BodyText"/>
+      </w:pPr>
+      <w:r>
+        <w:t xml:space="preserve">Most contemporary urban policy attempts to bridge the philosophical gap through social contract theory or rights-based models. A social contract asserts that citizens collectively agree to mutual protection. Rights theory posits that Arthur holds an inherent claim to life that compels others to prevent his death. John Rawls expanded these concepts by proposing that a just society operates on rules chosen from behind a veil of ignorance, where no individual knows if they will emerge as the outreach worker or the man freezing on the crate. From that position of uncertainty, a rational person would select a system that guarantees rescue.</w:t>
+      </w:r>
+    </w:p>
+    <w:p>
+      <w:pPr>
+        <w:pStyle w:val="BodyText"/>
+      </w:pPr>
+      <w:r>
+        <w:t xml:space="preserve">These philosophical bridges function in theory. In practice, they rely on contested premises. A determined skeptic can argue that Arthur opted out of the social contract. Politicians contest the legal scope of housing rights. The Rawlsian construction remains a thought experiment. When the bridge is built from abstract agreements, the obligation to intervene collapses under political pressure. The bridge fails.</w:t>
+      </w:r>
+    </w:p>
+    <w:p>
+      <w:pPr>
+        <w:pStyle w:val="BodyText"/>
+      </w:pPr>
+      <w:r>
+        <w:t xml:space="preserve">Philippa Foot’s natural goodness system replaces the abstract bridge with a biological one. For a living organism, evaluative judgment flows from physical description through the concept of species-characteristic functioning. When a clinical assessment documents the deterioration of Arthur’s prefrontal cortex, the assessment records the destruction of the physical capacity required for human flourishing. The obligation to intervene follows from the nature of the organism. A human body requires distinct environmental conditions to sustain cognitive function. Street exposure destroys those conditions. The destruction of the organism demands an intervention to restore the baseline. The biology dictates the duty.</w:t>
+      </w:r>
+    </w:p>
+    <w:p>
+      <w:pPr>
+        <w:pStyle w:val="BodyText"/>
+      </w:pPr>
+      <w:r>
+        <w:t xml:space="preserve">John Searle’s analysis of institutional facts reveals how the municipal system evades this biological duty. Searle distinguishes between natural facts that exist independently of human observation and institutional facts that exist because human systems agree to recognize them. The destruction of Arthur’s executive function constitutes a natural fact. The tablet record stating that Arthur declined services constitutes an institutional fact. The outreach protocol converted the natural reality of neurological shutdown into the institutional reality of a refused offer.</w:t>
+      </w:r>
+    </w:p>
+    <w:p>
+      <w:pPr>
+        <w:pStyle w:val="BodyText"/>
+      </w:pPr>
+      <w:r>
+        <w:t xml:space="preserve">This conversion operates as a moral choice disguised as administrative neutrality. By recording a biological failure as an autonomous decision, the system erases its obligation to act. The institutional fact shields the bureaucracy from the natural fact.</w:t>
+      </w:r>
+    </w:p>
+    <w:p>
+      <w:pPr>
+        <w:pStyle w:val="BodyText"/>
+      </w:pPr>
+      <w:r>
+        <w:t xml:space="preserve">The convergence of Foot and Searle closes the philosophical gap. The natural goodness system establishes that the destruction of a human nervous system carries intrinsic moral weight. The institutional analysis exposes the municipal tablet as a mechanism for moral evasion. The obligation to intervene relies on the physical reality rather than an external social contract. The human organism possesses a nature that demands preservation. To accurately describe the destruction of Arthur’s brain is to document an atrocity. The witness statement and the moral demand are the same document.</w:t>
+      </w:r>
+      <w:r>
+        <w:t xml:space="preserve"> </w:t>
+      </w:r>
+      <w:r>
+        <w:t xml:space="preserve"># Chapter 6: The Social Contract’s Hidden Assumption</w:t>
+      </w:r>
+    </w:p>
+    <w:p>
+      <w:pPr>
+        <w:pStyle w:val="BodyText"/>
+      </w:pPr>
+      <w:r>
+        <w:t xml:space="preserve">Every version of social contract theory begins with a gathering. Hobbes’s contractors emerge from the state of nature, calculating rational actors who agree to submit to sovereign authority because the alternative, the war of all against all, is worse than any arrangement the sovereign imposes. Locke’s contractors bring their natural rights into the compact and reserve them against government overreach. Rawls’s contractors deliberate behind a veil of ignorance, designing principles of justice without knowing their own position in the society those principles will govern.</w:t>
+      </w:r>
+    </w:p>
+    <w:p>
+      <w:pPr>
+        <w:pStyle w:val="BodyText"/>
+      </w:pPr>
+      <w:r>
+        <w:t xml:space="preserve">Arthur cannot attend any of these gatherings. He cannot calculate, because calculation requires the prefrontal function that the street has impaired. He cannot bring his rights to bear, because the institutional mechanisms through which rights are asserted require legal standing, documentation, and the capacity to navigate the processes through which standing is claimed. He cannot deliberate behind a veil of ignorance, because deliberation requires the cognitive architecture that two winters of cortisol saturation have degraded. The social contract, in each of its historical formulations, is built for participants who arrive capable. Arthur does not arrive capable.</w:t>
+      </w:r>
+    </w:p>
+    <w:p>
+      <w:pPr>
+        <w:pStyle w:val="BodyText"/>
+      </w:pPr>
+      <w:r>
+        <w:t xml:space="preserve">This is not an incidental feature of social contract theory. It is constitutive. The contract is designed to solve a particular problem, namely how rational actors who recognize each other’s capacity for reciprocal harm and benefit can establish stable cooperation. The logic of the contract depends on each party being a potential threat and a potential benefit to the others, representing someone whose agreement is worth securing because their violation of the agreement would cost something. A person who cannot threaten, cannot promise, cannot reciprocate, and cannot negotiate is not a party to the contract in any meaningful sense. They are what Rawls called an</w:t>
       </w:r>
       <w:r>
         <w:t xml:space="preserve"> </w:t>
@@ -709,7 +803,7 @@
         <w:t xml:space="preserve">“</w:t>
       </w:r>
       <w:r>
-        <w:t xml:space="preserve">is</w:t>
+        <w:t xml:space="preserve">outside</w:t>
       </w:r>
       <w:r>
         <w:t xml:space="preserve">”</w:t>
@@ -718,7 +812,61 @@
         <w:t xml:space="preserve"> </w:t>
       </w:r>
       <w:r>
-        <w:t xml:space="preserve">to</w:t>
+        <w:t xml:space="preserve">case, meaning someone for whom the contract’s principles generate no obligations because they are not parties to the original agreement.</w:t>
+      </w:r>
+    </w:p>
+    <w:p>
+      <w:pPr>
+        <w:pStyle w:val="BodyText"/>
+      </w:pPr>
+      <w:r>
+        <w:t xml:space="preserve">Rawls acknowledged this problem and attempted to address it in later work, arguing that the extension of justice to those who cannot participate in the original position, including people with severe cognitive disabilities, requires a separate theoretical treatment. He was right that it requires separate treatment. He did not finish that treatment, and the gap he identified is the gap that Arthur falls through in every city that has deployed Rawlsian-adjacent policy systems to govern its homelessness programs. The programs are designed to be fair to participants. Arthur is not a participant.</w:t>
+      </w:r>
+    </w:p>
+    <w:p>
+      <w:pPr>
+        <w:pStyle w:val="BodyText"/>
+      </w:pPr>
+      <w:r>
+        <w:t xml:space="preserve">Hobbes’s version of the problem is more brutal and more honest. In Leviathan, those who cannot protect themselves are not protected by the social compact because they have nothing to offer the compact in exchange for its protections. They exist in a permanent state of nature relative to the rest of society. The sovereign has no obligation to them derived from contract. Whatever obligations the sovereign might have are moral obligations that exist prior to and independent of the contract itself. Hobbes has no developed account of those prior obligations, which is why his theory produces a state that can legitimately ignore Arthur, as long as it does not commit harm against him.</w:t>
+      </w:r>
+    </w:p>
+    <w:p>
+      <w:pPr>
+        <w:pStyle w:val="BodyText"/>
+      </w:pPr>
+      <w:r>
+        <w:t xml:space="preserve">The gap is real and must be acknowledged rather than papered over. Social contract theory, in its standard formulations, does not generate obligations toward Arthur. Nussbaum, in Creating Capabilities, is clear about this, noting that her capabilities approach was developed partly to address the population that contract theory excludes. The capabilities approach does not derive obligation from a hypothetical agreement. It derives obligation from the observable fact that particular capabilities are constitutive of a genuinely human life, and that a just society has an affirmative duty to bring every person above the threshold of those capabilities. This derivation does not require Arthur’s participation. It requires only that he is a human being, which is a fact about him that the street has not changed.</w:t>
+      </w:r>
+    </w:p>
+    <w:p>
+      <w:pPr>
+        <w:pStyle w:val="BodyText"/>
+      </w:pPr>
+      <w:r>
+        <w:t xml:space="preserve">The political implication is that the state’s obligation to Arthur does not rest on the same foundation as its obligation to taxpaying, voting, contracting citizens. It rests on a prior foundation, which is the natural law obligation to protect the conditions required for any human being to function as a human being, prior to and independent of any contractual relationship. This is not a novel claim in Western political philosophy. Cicero established it in De Re Publica. The Stoics grounded it in the common logos that all rational beings share. Grotius developed it into the foundational principle of international law, arguing that particular obligations hold between persons independent of any treaty, compact, or mutual agreement, because the nature of persons generates them.</w:t>
+      </w:r>
+    </w:p>
+    <w:p>
+      <w:pPr>
+        <w:pStyle w:val="BodyText"/>
+      </w:pPr>
+      <w:r>
+        <w:t xml:space="preserve">What is novel is applying this pre-contractual obligation to the particular population that modern liberal states have created through the combination of housing scarcity, inadequate mental health infrastructure, and service systems structured to serve participants rather than to rescue the incapacitated. The traditional natural law systems were not designed for this population, because this population, chronically unsheltered, neurologically impaired by years of street exposure, and classified as non-compliant by the systems nominally responsible for their care, did not exist at the scale it exists now. The obligation is pre-modern. The population it must address is a consequence of modern conditions. The intersection of the two is what this book is about.</w:t>
+      </w:r>
+      <w:r>
+        <w:t xml:space="preserve"> </w:t>
+      </w:r>
+      <w:r>
+        <w:t xml:space="preserve"># Chapter 7: Natural Law Without God</w:t>
+      </w:r>
+    </w:p>
+    <w:p>
+      <w:pPr>
+        <w:pStyle w:val="BodyText"/>
+      </w:pPr>
+      <w:r>
+        <w:t xml:space="preserve">Hugo Grotius wrote, in 1625, a sentence that changed the history of political philosophy. He argued that the law of nations would hold</w:t>
       </w:r>
       <w:r>
         <w:t xml:space="preserve"> </w:t>
@@ -727,7 +875,7 @@
         <w:t xml:space="preserve">“</w:t>
       </w:r>
       <w:r>
-        <w:t xml:space="preserve">ought</w:t>
+        <w:t xml:space="preserve">even if we were to concede, what without the greatest wickedness cannot be conceded, that there is no God.</w:t>
       </w:r>
       <w:r>
         <w:t xml:space="preserve">”</w:t>
@@ -736,7 +884,281 @@
         <w:t xml:space="preserve"> </w:t>
       </w:r>
       <w:r>
-        <w:t xml:space="preserve">without explaining what justified the transition. From</w:t>
+        <w:t xml:space="preserve">The Latin phrase, etiamsi daremus non esse Deum, has been called the founding claim of secular natural law. What Grotius was asserting is that some moral obligations are grounded in the nature of things, not in divine command, and that you can recognize them without reference to God at all.</w:t>
+      </w:r>
+    </w:p>
+    <w:p>
+      <w:pPr>
+        <w:pStyle w:val="BodyText"/>
+      </w:pPr>
+      <w:r>
+        <w:t xml:space="preserve">This matters for the argument of this book because the natural law tradition is the philosophical model that most naturally supports what this book is claiming, which is that Arthur’s biological condition generates an obligation to intervene that does not depend on his consent, his contract membership, or his cognitive performance, and because that tradition has historically been entangled with theological premises making it inaccessible to secular political discourse. A secular natural law argument is the one that can be heard across the widest range of the political landscape. Here is that argument.</w:t>
+      </w:r>
+    </w:p>
+    <w:p>
+      <w:pPr>
+        <w:pStyle w:val="BodyText"/>
+      </w:pPr>
+      <w:r>
+        <w:t xml:space="preserve">Cicero, writing in De Re Publica three centuries before Christianity, grounded law in the rational nature that all human beings share. True law, he wrote, is right reason in agreement with nature, meaning it is universal, unchanging, and binding on all nations and all times. Its source is not a legislature, not a custom, not a divine promulgation. It is the nature of the rational creature itself. Because all human beings share this rational nature, they share in a universal moral community whose obligations do not depend on citizenship, agreement, or institutional membership. The slave and the senator are both members of the same rational community. The obligation to treat them both as ends rather than as instruments follows from their shared participation in reason.</w:t>
+      </w:r>
+    </w:p>
+    <w:p>
+      <w:pPr>
+        <w:pStyle w:val="BodyText"/>
+      </w:pPr>
+      <w:r>
+        <w:t xml:space="preserve">Marcus Aurelius, a practicing Stoic writing four centuries after Cicero, pushed this further. The Stoic doctrine of cosmopolitanism, which holds that all rational beings belong to a single world-city whose laws are the laws of reason, generated obligations toward the suffering of strangers. In the Meditations, Aurelius returns repeatedly to the theme that what harms the hive harms the bee, meaning that the good of any rational being is the concern of every rational being, not because of a contractual arrangement but because rationality itself is the shared medium through which all of them participate in the universe’s ordering principle. The suffering of one diminishes all.</w:t>
+      </w:r>
+    </w:p>
+    <w:p>
+      <w:pPr>
+        <w:pStyle w:val="BodyText"/>
+      </w:pPr>
+      <w:r>
+        <w:t xml:space="preserve">Neither Cicero nor Aurelius grounded this in God. Cicero’s cosmic reason is immanent in nature. Aurelius’s logos is the rational structure of the cosmos itself, not a personal deity who commands obedience. Grotius, drawing on both, made the secularity clear, stating that the natural law holds whether God exists or not, because it is grounded in the nature of things rather than in divine will.</w:t>
+      </w:r>
+    </w:p>
+    <w:p>
+      <w:pPr>
+        <w:pStyle w:val="BodyText"/>
+      </w:pPr>
+      <w:r>
+        <w:t xml:space="preserve">The biological version of this argument is the one this book needs. Human beings are organisms of a particular kind. That kind has characteristic needs, including sleep, nutrition, physical safety, metabolic stability, and the neurological decompression that follows when these needs are reliably met. These needs are not preferences or cultural constructions. They are biological facts about what kind of organism a human being is. When an environment systematically destroys the capacity to meet these needs, as chronic street exposure does, it destroys the conditions required for the organism to function as the kind of organism it is. The destruction is bad relative to the organism’s nature. The obligation to prevent that destruction, and to restore the conditions when destruction has occurred, follows from the nature of the organism, not from God, not from a social contract, not from a rights claim, but from the observable fact of what a human being requires to be a human being.</w:t>
+      </w:r>
+    </w:p>
+    <w:p>
+      <w:pPr>
+        <w:pStyle w:val="BodyText"/>
+      </w:pPr>
+      <w:r>
+        <w:t xml:space="preserve">Philippa Foot, as Chapter 4 established, provides the contemporary philosophical model that closes this argument. Natural goodness is not a property conferred by social membership or divine grace. It is a property of organisms relative to their kind, derivable from observation of what characterizes the life of organisms of that kind when they are living it well. A human being living well is sleeping, eating, connected to others, capable of deliberate action, and oriented toward a future. Arthur under the bridge is none of these things. His condition is bad relative to what he is, and the badness generates prescriptive force, creating an obligation to restore the conditions, without any theological premise in the argument.</w:t>
+      </w:r>
+    </w:p>
+    <w:p>
+      <w:pPr>
+        <w:pStyle w:val="BodyText"/>
+      </w:pPr>
+      <w:r>
+        <w:t xml:space="preserve">The secular natural law argument reaches a policy audience that the theological natural law argument does not, and it reaches it without sacrificing the philosophical rigor that the biological floor claim requires. The obligation to rescue Arthur is not a religious obligation. It is an obligation grounded in what Arthur is, which is a member of the rational animal species whose nature includes the needs that street exposure destroys and whose good, in Cicero’s formulation, is the concern of every other member of that species by virtue of their shared participation in the same kind of life.</w:t>
+      </w:r>
+      <w:r>
+        <w:t xml:space="preserve"> </w:t>
+      </w:r>
+      <w:r>
+        <w:t xml:space="preserve"># Chapter 8: The Hierarchy of Obligation</w:t>
+      </w:r>
+    </w:p>
+    <w:p>
+      <w:pPr>
+        <w:pStyle w:val="BodyText"/>
+      </w:pPr>
+      <w:r>
+        <w:t xml:space="preserve">Arthur walked into the Phase Zero intake center and received a keycard to a hard-sided room. He locked the door behind him, lay down on the cot, and stared at the ceiling. For the first time in five years, he had a defensible perimeter. Over the next ninety minutes, his resting heart rate dropped from one hundred and ten beats per minute to eighty-five. His adrenal glands reduced their cortisol production. His autonomic nervous system began the slow shift from sympathetic overdrive to parasympathetic recovery. The metabolic stabilization had begun.</w:t>
+      </w:r>
+    </w:p>
+    <w:p>
+      <w:pPr>
+        <w:pStyle w:val="BodyText"/>
+      </w:pPr>
+      <w:r>
+        <w:t xml:space="preserve">Some obligations precede others. This logical sequence dictates that foundational conditions must exist before higher-order functions become possible. Demanding complex cognitive performance before establishing biological stability constitutes a category error. This error produced the failure California documented when the state spent twenty-four billion dollars on homelessness interventions while the unsheltered population continued to grow.</w:t>
+      </w:r>
+    </w:p>
+    <w:p>
+      <w:pPr>
+        <w:pStyle w:val="BodyText"/>
+      </w:pPr>
+      <w:r>
+        <w:t xml:space="preserve">Amartya Sen’s development model establishes this logical structure. Sen demonstrates that human development requires expanding capabilities, which represent the real freedoms that people value and the physical ability to exercise them. These capabilities form a rigid hierarchy. Bodily health and physical integrity operate as the primary tier. Practical reason, representing the capacity to deliberate, plan, and form a conception of the good, builds upon that foundation. Affiliation, community participation, and control over the social environment build upon practical reason. Each capability serves as the prerequisite for the ones above it.</w:t>
+      </w:r>
+    </w:p>
+    <w:p>
+      <w:pPr>
+        <w:pStyle w:val="BodyText"/>
+      </w:pPr>
+      <w:r>
+        <w:t xml:space="preserve">During his years under the bridge, Arthur lost access to the primary tier. The cold, malnutrition, and accumulated stress of street exposure degraded his bodily health. Every municipal sweep operation that destroyed his possessions and displaced his encampment violated his physical integrity. Without the primary tier, practical reason became unavailable to him. Without practical reason, the affiliation programming, vocational training, and case management sessions offered by the municipal system amounted to third-tier demands presented to an organism stripped to the first tier.</w:t>
+      </w:r>
+    </w:p>
+    <w:p>
+      <w:pPr>
+        <w:pStyle w:val="BodyText"/>
+      </w:pPr>
+      <w:r>
+        <w:t xml:space="preserve">This hierarchy inversion defines the failure mode of the American housing system. The system demands participation in higher-tier programs as a condition of access to basic resources. To receive shelter, an individual must sign a behavior contract, which requires practical reason. To receive case management, they must attend scheduled appointments, which requires the executive function to track time. To access supportive housing, they must demonstrate housing readiness, which requires the cognitive architecture that street exposure progressively destroys. These eligibility requirements function as tier-three demands imposed on a damaged nervous system. They filter out the most vulnerable populations who require immediate biological rescue.</w:t>
+      </w:r>
+    </w:p>
+    <w:p>
+      <w:pPr>
+        <w:pStyle w:val="BodyText"/>
+      </w:pPr>
+      <w:r>
+        <w:t xml:space="preserve">Phase Zero within the Material Dignity Infrastructure, abbreviated as MDI, corrects this inversion. This clinical-housing model structures intervention through three non-discretionary stages, beginning with Metabolic Stabilization. Phase Zero establishes the biological floor unconditionally. It provides an individual locked room, continuous nutrition, medical stabilization, and a ninety-day decompression period. The facility imposes zero compliance requirements and requires zero behavior contracts. During this decompression window, sleep architecture restores, systemic inflammation drops, and the prefrontal neural networks begin to recover. The system stabilizes the organism first. Institutional assessment occurs only after the biological conditions for valid cognitive evaluation have been met.</w:t>
+      </w:r>
+    </w:p>
+    <w:p>
+      <w:pPr>
+        <w:pStyle w:val="BodyText"/>
+      </w:pPr>
+      <w:r>
+        <w:t xml:space="preserve">The transition from Phase Zero to the relational layer represents the second level of the hierarchy. Once the biological floor exists, the relational environment determines whether the biological stabilization converts into long-term recovery. This progression relies on a relational ontological model. A human being becomes a person through social recognition. The isolated organism requires a community to construct an identity. The Finnish housing model designed for this layer while the American system abandoned it. The housing advisor, the pod steward, the daily kitchen encounter, and the community council constitute the second tier of a hierarchical architecture. They provide the relational scaffolding required to rebuild the self. This tier becomes available to the organism only because the first tier has secured the physical perimeter.</w:t>
+      </w:r>
+    </w:p>
+    <w:p>
+      <w:pPr>
+        <w:pStyle w:val="BodyText"/>
+      </w:pPr>
+      <w:r>
+        <w:t xml:space="preserve">The third tier encompasses identity reconstruction, employment, education, and civic participation. This tier becomes accessible after the second tier has generated the relational ground where identity capital accumulates. Klodnick and Samuels’s 2020 longitudinal research establishes the first year post-housing as the critical window for this accumulation. A person who spends ninety days in biological decompression and six months in a structured relational environment arrives at this window possessing the neurological capacity to engage vocational programming and the tenancy bridge guarantee. Conversely, a person housed without the first two tiers arrives at the same window with a nervous system calibrated to threat. The vocational programming fails because the organism lacks the capacity to engage it.</w:t>
+      </w:r>
+    </w:p>
+    <w:p>
+      <w:pPr>
+        <w:pStyle w:val="BodyText"/>
+      </w:pPr>
+      <w:r>
+        <w:t xml:space="preserve">This biological and relational progression maps to the CalAIM service billing tranches. The initial recuperative care rate of twenty-one thousand nine hundred dollars per unit stabilizes the biological floor during Phase Zero decompression. Once the individual transitions, the tenancy sustaining code of fourteen thousand four hundred dollars and the housing navigation code of eight thousand four hundred dollars finance the relational layer. The stabilized blended average of eighteen thousand two hundred dollars per unit sustains the full hierarchy of care. The operational sequence dictates the fiscal sustainability.</w:t>
+      </w:r>
+    </w:p>
+    <w:p>
+      <w:pPr>
+        <w:pStyle w:val="BodyText"/>
+      </w:pPr>
+      <w:r>
+        <w:t xml:space="preserve">Sen’s insight, transposed into the MDI architectural logic, produces a single diagnostic principle. The sequence determines the outcome. A system that provides resources out of sequence produces expensive failure and wrongly attributes that failure to the population’s pathology rather than the institutional sequence error. The hierarchy of obligation functions as the engineering specification for human survival.</w:t>
+      </w:r>
+      <w:r>
+        <w:t xml:space="preserve"> </w:t>
+      </w:r>
+      <w:r>
+        <w:t xml:space="preserve"># Chapter 9: Institutional Capture and Moral Responsibility</w:t>
+      </w:r>
+    </w:p>
+    <w:p>
+      <w:pPr>
+        <w:pStyle w:val="BodyText"/>
+      </w:pPr>
+      <w:r>
+        <w:t xml:space="preserve">Hannah Arendt did not write about the Los Angeles homeless services industry. She wrote about the trial of Adolf Eichmann, the bureaucrat who coordinated the logistics of mass murder and who, in the dock, displayed no malice, no ideology, and no apparent awareness that he had done anything other than his job. Arendt called this the banality of evil, by which she meant that ordinary institutional behavior, executed without moral reflection by ordinary people following ordinary procedures, can produce catastrophic outcomes that no individual within the system intends or acknowledges. You do not need villains to generate atrocity. You need incentive structures, division of responsibility, and the professional norm of not looking too hard at what the system is producing.</w:t>
+      </w:r>
+    </w:p>
+    <w:p>
+      <w:pPr>
+        <w:pStyle w:val="BodyText"/>
+      </w:pPr>
+      <w:r>
+        <w:t xml:space="preserve">California’s homelessness services apparatus does not produce atrocity in Arendt’s sense. It produces a different kind of outcome that shares the same mechanism. Thousands of people work within it every day with genuine intention to help. They are case managers, outreach workers, shelter operators, county administrators, and grant writers. They care about the population they serve. They also operate within an incentive structure that rewards activity over outcomes, measures contacts over stability, and allocates funding based on the number of individuals processed rather than the number of individuals housed. Within that structure, the system works exactly as designed. Arthur remains on the street. The reports are filed. No one is responsible.</w:t>
+      </w:r>
+    </w:p>
+    <w:p>
+      <w:pPr>
+        <w:pStyle w:val="BodyText"/>
+      </w:pPr>
+      <w:r>
+        <w:t xml:space="preserve">James Buchanan and Gordon Tullock described this mechanism in 1962, before the modern homelessness industry existed. Their analysis of bureaucratic behavior identified a predictable pattern, whereby public agencies expand their budgets, protect their jurisdictions, and embed their operational models into the regulatory standards that new entrants must satisfy. Not from corruption, but from the logic of institutional self-preservation. An agency whose budget is justified by the number of clients it serves has a structural disincentive to reduce the number of clients it serves. This is not a cynical observation about human nature. It is a description of how incentive structures shape behavior in any organization, public or private. The homelessness services industry is not exceptional in this regard. It is an ordinary institutional response to a misaligned principal-agent relationship.</w:t>
+      </w:r>
+    </w:p>
+    <w:p>
+      <w:pPr>
+        <w:pStyle w:val="BodyText"/>
+      </w:pPr>
+      <w:r>
+        <w:t xml:space="preserve">Tyler Cowen’s diagnosis of American institutional stagnation adds a layer to this picture. Regulatory accumulation, as Cowen documents, produces a kind of civilizational complacency in which the existing arrangement becomes self-reinforcing, meaning that existing providers capture the procurement process, write the compliance standards, and use those standards to block alternatives that would reduce their market share. The homelessness services industry exhibits this pattern with precision. The credentialing requirements for service providers, the HMIS data ownership structures, and the county behavioral health contract vehicles represent quality standards that also function as barriers to entry for models that might produce better outcomes. A proposal for a new institutional architecture faces not just competition from existing providers but a regulatory environment that existing providers have shaped over decades to favor their operational models.</w:t>
+      </w:r>
+    </w:p>
+    <w:p>
+      <w:pPr>
+        <w:pStyle w:val="BodyText"/>
+      </w:pPr>
+      <w:r>
+        <w:t xml:space="preserve">The revenue machine is the name for this dynamic when it operates at the scale of a twenty-four-billion-dollar state program. The machine does not conspire. It does not hold meetings to decide how to perpetuate homelessness. It operates through the cumulative effect of thousands of ordinary institutional decisions, each reasonable in isolation, each reinforcing the conditions that justify the machine’s continued existence. The outreach worker who logs a contact rather than a housing placement is following protocol. The program director who measures shelter bed occupancy rather than housing retention is following the contract’s performance metrics. The county administrator who funds the established provider over the novel model is following procurement policy. No one is lying. No one is breaking rules. The machine produces its output through the aggregate of individually defensible acts.</w:t>
+      </w:r>
+    </w:p>
+    <w:p>
+      <w:pPr>
+        <w:pStyle w:val="BodyText"/>
+      </w:pPr>
+      <w:r>
+        <w:t xml:space="preserve">James Scott’s analysis of high-modernist institutional schemes identifies a related failure mode. Large-scale institutions, Scott argues, systematically fail when they attempt to impose a simplified, legible order on complex local realities whose irreducible detail they cannot perceive or process. The local knowledge that makes a community work, including who watches whose gear, who has a dog named Ranger, and who had a falling out with someone three pods over, is the knowledge that a large institution cannot hold. The institution replaces this knowledge with categories, such as homeless individual, chronically homeless individual, high-acuity client, and non-compliant resident. The categories are operationally necessary and epistemically destructive. They make the institution’s work manageable and the institution’s outcomes predictable, with the result that the person who cannot be reduced to a category falls through the gaps between categories and remains on the street.</w:t>
+      </w:r>
+    </w:p>
+    <w:p>
+      <w:pPr>
+        <w:pStyle w:val="BodyText"/>
+      </w:pPr>
+      <w:r>
+        <w:t xml:space="preserve">The moral question that Arendt’s analysis produces asks what the ethical status is of a person who works within this machine and knows what it is producing. Not the executive who designed the incentive structure and not the politician who allocated the funding, but the caseworker who logs the contact, the shelter director who measures the bed count, and the bureaucrat who writes the compliance report. Arendt’s answer, derived from Eichmann’s case, is that the abdication of moral judgment, representing the choice to follow procedure rather than to think from the perspective of the person the procedure is supposed to serve, is itself a moral act. Thoughtlessness is not a defense. It is the mechanism.</w:t>
+      </w:r>
+    </w:p>
+    <w:p>
+      <w:pPr>
+        <w:pStyle w:val="BodyText"/>
+      </w:pPr>
+      <w:r>
+        <w:t xml:space="preserve">For the people who work in the homelessness services system and are reading this with recognition, this chapter is not an accusation. The individuals within the machine are, with rare exceptions, doing what their institutions reward them for doing, and they entered those institutions because they wanted to help. The indictment is structural. The question is whether structural indictment produces structural change, or whether naming the machine is just another form of moral theater that changes nothing.</w:t>
+      </w:r>
+    </w:p>
+    <w:p>
+      <w:pPr>
+        <w:pStyle w:val="BodyText"/>
+      </w:pPr>
+      <w:r>
+        <w:t xml:space="preserve">The critique that nothing changes no matter what anyone does is historically well-supported and deserves honest engagement rather than optimism. Arendt’s own life did not end in triumph. She documented evil; it continued. But she also observed, across her career, that the moment a machine becomes visible, representing the moment when its mechanism is named and its outputs are traced to their causes, something shifts in the moral environment in which it operates. The machine does not disappear. It becomes harder to pretend that the people within it bear no responsibility for what it produces.</w:t>
+      </w:r>
+    </w:p>
+    <w:p>
+      <w:pPr>
+        <w:pStyle w:val="BodyText"/>
+      </w:pPr>
+      <w:r>
+        <w:t xml:space="preserve">Changing the basis of evaluation is the concrete reform that follows from this analysis. An institution judged by outcomes, meaning housing retention at twenty-four months rather than contacts logged, cannot sustain a business model organized around client persistence. An institution judged by the Finnish benchmark of eighty to ninety percent retention cannot present the American forty percent as a reasonable outcome given available resources. The measurement instrument is a moral instrument. What gets measured determines what gets produced. The machine will not reform itself. But a machine operating under a different measurement regime will produce different outputs, because the institutional behavior it rewards will be different. That is not optimism. It is the same engineering logic that John Snow applied to the Broad Street pump. Find the mechanism. Intervene at the right point. The pump handle, in this case, is the performance metric.</w:t>
+      </w:r>
+      <w:r>
+        <w:t xml:space="preserve"> </w:t>
+      </w:r>
+      <w:r>
+        <w:t xml:space="preserve"># Chapter 10: The Legitimacy of Compelled Care</w:t>
+      </w:r>
+    </w:p>
+    <w:p>
+      <w:pPr>
+        <w:pStyle w:val="BodyText"/>
+      </w:pPr>
+      <w:r>
+        <w:t xml:space="preserve">Thomas Szasz spent fifty years arguing that involuntary psychiatric commitment is the therapeutic state’s primary instrument of social control, that the elastic definition of mental illness has historically expanded to capture political dissidents, social nonconformists, and inconvenient individuals rather than to treat genuine disease, and that the language of care has functioned as a cover for coercion that a free society should not tolerate. He was right about most of this. Anyone who proposes compelled care without first acknowledging what Szasz documented, including the asylum era, the Soviet use of psychiatry as a political weapon, and the racialized application of conservatorship in California’s recent history, is not making an honest argument. This chapter begins with that recognition.</w:t>
+      </w:r>
+    </w:p>
+    <w:p>
+      <w:pPr>
+        <w:pStyle w:val="BodyText"/>
+      </w:pPr>
+      <w:r>
+        <w:t xml:space="preserve">Szasz is right that the therapeutic state expands. He is right that voluntary and involuntary blur within institutions that have incentives to retain clients. He is right that a diagnosis of incapacity has been used to override preferences that were not incapacitated, only inconvenient. The history he cataloged is real and recent enough to be legally actionable in California courts. An argument for compelled care that does not take this history seriously is not an argument that the civil libertarian tradition is obligated to engage. It can be dismissed as naivety dressed as compassion.</w:t>
+      </w:r>
+    </w:p>
+    <w:p>
+      <w:pPr>
+        <w:pStyle w:val="BodyText"/>
+      </w:pPr>
+      <w:r>
+        <w:t xml:space="preserve">Here is the honest argument that takes Szasz seriously and proceeds anyway.</w:t>
+      </w:r>
+    </w:p>
+    <w:p>
+      <w:pPr>
+        <w:pStyle w:val="BodyText"/>
+      </w:pPr>
+      <w:r>
+        <w:t xml:space="preserve">Liberty, in the sense that Mill defined it, representing the right to be left alone and to make choices about one’s own life without interference from others, requires a functioning brain. Not because cognitive performance is the criterion for moral worth. This book’s central claim is the opposite, namely that dignity precedes function, meaning that a person’s claim on moral care is not conditional on the capacity to exercise it. But liberty in Mill’s sense, representing the substantive capacity to guide one’s own life according to personal values and preferences, requires the neurological substrate of deliberation. Without a functioning prefrontal cortex, there is no deliberation occurring. There is reflex, survival response, craving, and threat reaction. These are real experiences. They are not choices in the sense that Mill’s harm principle requires in order to apply.</w:t>
+      </w:r>
+    </w:p>
+    <w:p>
+      <w:pPr>
+        <w:pStyle w:val="BodyText"/>
+      </w:pPr>
+      <w:r>
+        <w:t xml:space="preserve">The person in dorsal-vagal shutdown, which is the physiological state where the nervous system has suspended voluntary activity because the perceived threat is total and inescapable, is not exercising liberty when waving off an outreach worker. Their nervous system is executing a survival reflex that evolved to protect organisms from predators. Stephen Porges’s polyvagal research establishes this mechanism in clinical detail. The practical implication is that</w:t>
       </w:r>
       <w:r>
         <w:t xml:space="preserve"> </w:t>
@@ -745,7 +1167,7 @@
         <w:t xml:space="preserve">“</w:t>
       </w:r>
       <w:r>
-        <w:t xml:space="preserve">people suffer</w:t>
+        <w:t xml:space="preserve">respecting the refusal</w:t>
       </w:r>
       <w:r>
         <w:t xml:space="preserve">”</w:t>
@@ -754,7 +1176,23 @@
         <w:t xml:space="preserve"> </w:t>
       </w:r>
       <w:r>
-        <w:t xml:space="preserve">to</w:t>
+        <w:t xml:space="preserve">of a person in shutdown is not a defense of liberty. It is a decision to treat a biological defense response as a considered preference and walk away from someone who cannot advocate for themselves in any meaningful sense at that moment.</w:t>
+      </w:r>
+    </w:p>
+    <w:p>
+      <w:pPr>
+        <w:pStyle w:val="BodyText"/>
+      </w:pPr>
+      <w:r>
+        <w:t xml:space="preserve">Mill wrote for a population of intact rational agents. His harm principle, which asserts that the only legitimate basis for state coercion is preventing harm to others, does not address the population whose capacity for rational agency has been physically destroyed by environmental conditions outside their control. Martha Nussbaum’s capabilities approach provides the model Mill’s does not. Nussbaum argues that a just society has an obligation to bring every person above a threshold of the capabilities required for a human life. Those capabilities include bodily health, practical reason, and the emotional foundations of social engagement. A person below this threshold is not exercising freedom when they remain below it. They are failing to achieve the conditions that freedom requires. Restoring those conditions is not a violation of their autonomy. It is the precondition for their autonomy to exist in a form that matters morally.</w:t>
+      </w:r>
+    </w:p>
+    <w:p>
+      <w:pPr>
+        <w:pStyle w:val="BodyText"/>
+      </w:pPr>
+      <w:r>
+        <w:t xml:space="preserve">Gerald Dworkin’s analysis of autonomy and paternalism establishes the justification for intervention that this argument requires. Dworkin distinguishes between hard and soft paternalism. Hard paternalism overrides the genuine preferences of a competent agent for their own good. Soft paternalism intervenes when the choice being</w:t>
       </w:r>
       <w:r>
         <w:t xml:space="preserve"> </w:t>
@@ -763,7 +1201,7 @@
         <w:t xml:space="preserve">“</w:t>
       </w:r>
       <w:r>
-        <w:t xml:space="preserve">we should relieve suffering.</w:t>
+        <w:t xml:space="preserve">respected</w:t>
       </w:r>
       <w:r>
         <w:t xml:space="preserve">”</w:t>
@@ -772,7 +1210,147 @@
         <w:t xml:space="preserve"> </w:t>
       </w:r>
       <w:r>
-        <w:t xml:space="preserve">From</w:t>
+        <w:t xml:space="preserve">does not reflect the genuine preferences of a competent agent, because the conditions of competence are not present. Compelled care for the person whose prefrontal cortex has been destroyed by street exposure is soft paternalism in Dworkin’s sense. It does not override a genuine choice. It responds to the absence of the conditions under which genuine choice is possible.</w:t>
+      </w:r>
+    </w:p>
+    <w:p>
+      <w:pPr>
+        <w:pStyle w:val="BodyText"/>
+      </w:pPr>
+      <w:r>
+        <w:t xml:space="preserve">The argument requires four conditions to hold simultaneously before compelled intervention is legitimate. All four must be present; the absence of any one defeats the justification. First, the neurological destruction of autonomous agency must be verified through clinical assessment, not asserted by an administrator seeking to manage a difficult client. Second, the finding must be reviewed and authorized under California legal standards, applying the petition structures of CARE Court or the grave disability criteria of Lanterman-Petris-Short conservatorship rules, processed through courts with adequate procedural protections rather than an institutional determination made without adversarial review. Third, the placement must be in the least restrictive environment consistent with clinical need, integrating relational protocols where peer advocates and pod stewards assist the individual. The MDI tower’s Anti-Detention Covenant makes this concrete, guaranteeing that voluntary residents retain unrestricted egress at all times, and involuntary placement converts to voluntary status the moment clinical stabilization permits. Fourth, the intervention must be time-limited and subject to mandatory periodic review, with a defined clinical threshold that triggers transition back to voluntary status.</w:t>
+      </w:r>
+    </w:p>
+    <w:p>
+      <w:pPr>
+        <w:pStyle w:val="BodyText"/>
+      </w:pPr>
+      <w:r>
+        <w:t xml:space="preserve">Szasz defeats unconstrained therapeutic state authority. He does not defeat this four-condition structure. His argument requires a claim of unconditional autonomy that does not survive contact with the clinical reality of a person in dorsal-vagal shutdown. A position that treats every refusal as a valid exercise of liberty regardless of the neurological state of the person refusing is not a defense of liberty. It is a philosophical commitment that kills people by treating their shutdown response as a preference and their survival reflex as a choice.</w:t>
+      </w:r>
+    </w:p>
+    <w:p>
+      <w:pPr>
+        <w:pStyle w:val="BodyText"/>
+      </w:pPr>
+      <w:r>
+        <w:t xml:space="preserve">The harder version of Szasz’s objection is institutional, questioning whether any real institution can be trusted to apply the four-condition structure narrowly rather than using it as a template for expanding its scope. This is the operational risk that the civil libertarian tradition is right to insist on. The answer cannot be philosophical. It must be structural. The Anti-Detention Covenant, which guarantees unrestricted egress for voluntary residents, is a structural guarantee that Process 1 cannot be reclassified as Process 2 by institutional pressure. The Rapid Transition Protocol, where crisis produces transfer rather than eviction, removes the institutional incentive to manage difficult residents through the legal pathway rather than through relational support. These features do not make institutional abuse impossible. Nothing does. They close doors through which abuse has historically entered, and they are the minimum structural preconditions for any institution operating a legal access pathway to claim that it is applying the pathway as intended.</w:t>
+      </w:r>
+    </w:p>
+    <w:p>
+      <w:pPr>
+        <w:pStyle w:val="BodyText"/>
+      </w:pPr>
+      <w:r>
+        <w:t xml:space="preserve">The argument for compelled care does not require confidence in institutions. It requires only recognition that the alternative, including leaving a person in total neurological shutdown on the street in deference to a refusal they did not cognitively generate because the institution that might intervene cannot be trusted, is a choice with consequences. Those consequences arrive on the pavement, at night, in winter, and they are as concrete as any choice the institution might make. Inaction is an action. The question is not whether we intervene but which intervention we choose, and on what grounds. The grounds this book offers are biological, constrained, procedurally protected, and reversible. They are not sufficient to trust any particular institution. They are sufficient to establish that compelled care, under these conditions, is a moral obligation rather than a moral violation.</w:t>
+      </w:r>
+      <w:r>
+        <w:t xml:space="preserve"> </w:t>
+      </w:r>
+      <w:r>
+        <w:t xml:space="preserve"># Chapter 11: John Snow and the Moral Physicist</w:t>
+      </w:r>
+    </w:p>
+    <w:p>
+      <w:pPr>
+        <w:pStyle w:val="BodyText"/>
+      </w:pPr>
+      <w:r>
+        <w:t xml:space="preserve">In the summer of 1854, Soho was dying. The Broad Street cholera outbreak killed more than six hundred people in ten days, representing one of the highest mortality rates the city had recorded. The prevailing theory attributed cholera to miasma, which was defined as foul air rising from the soil and refuse of densely populated neighborhoods. Physicians recommended improved ventilation. Ministers recommended prayer. City officials debated sanitary reform. The deaths continued.</w:t>
+      </w:r>
+    </w:p>
+    <w:p>
+      <w:pPr>
+        <w:pStyle w:val="BodyText"/>
+      </w:pPr>
+      <w:r>
+        <w:t xml:space="preserve">John Snow did not accept the miasma theory. He had been skeptical of it for years, on the grounds that it could not account for the distinct patterns of infection he had observed in prior outbreaks. Miasma should affect everyone in a given neighborhood roughly equally. The distribution of cholera deaths was not equal. It was clustered. Several streets had many deaths; adjacent streets had almost none. This clustering was a pattern that the miasma theory could not explain, and Snow was the kind of mind that treated unexplained patterns as evidence against their explaining theory rather than as noise to be dismissed.</w:t>
+      </w:r>
+    </w:p>
+    <w:p>
+      <w:pPr>
+        <w:pStyle w:val="BodyText"/>
+      </w:pPr>
+      <w:r>
+        <w:t xml:space="preserve">He began mapping. He recorded each death by its home address, plotted the addresses on a street map of Soho, and looked at the result. The deaths clustered around a single point, namely the public water pump on Broad Street. This observation was not itself conclusive, since the residents of the surrounding streets all used the same pump, meaning proximity to the pump established correlation rather than causation. Snow went further. He interviewed survivors and neighbors to understand who had drunk from the Broad Street pump and who had used other water sources. The brewery workers on Broad Street, who drank beer rather than water, had no deaths. The workhouse residents nearby, who had their own internal pump, had almost no deaths despite being in the center of the outbreak zone. The pattern was consistent across every data point Snow could collect.</w:t>
+      </w:r>
+    </w:p>
+    <w:p>
+      <w:pPr>
+        <w:pStyle w:val="BodyText"/>
+      </w:pPr>
+      <w:r>
+        <w:t xml:space="preserve">He then identified the causal mechanism. The Broad Street pump drew from a well that had been contaminated by a cesspit leaking into the groundwater nearby. The cholera, whatever cholera was, since the germ theory of disease was not yet established, was in the water. The pump was delivering contaminated water to hundreds of people every day, and the deaths were the output of that delivery.</w:t>
+      </w:r>
+    </w:p>
+    <w:p>
+      <w:pPr>
+        <w:pStyle w:val="BodyText"/>
+      </w:pPr>
+      <w:r>
+        <w:t xml:space="preserve">Snow went to the Board of Guardians and asked them to remove the handle from the Broad Street pump. They agreed, reluctantly and skeptically. He removed the handle. The outbreak collapsed within days.</w:t>
+      </w:r>
+    </w:p>
+    <w:p>
+      <w:pPr>
+        <w:pStyle w:val="BodyText"/>
+      </w:pPr>
+      <w:r>
+        <w:t xml:space="preserve">The sequence of Snow’s method is what makes it instructive as a model for this book. He did not begin with a theory. He began with a pattern, representing a cluster of deaths that the prevailing explanation could not account for. He mapped the pattern at the level of particular individuals and distinct locations, not at the level of aggregate statistics. He identified a mechanism that could explain the pattern, namely a physical pathway through which something was being delivered that caused the observed harm. He intervened at the mechanism, physically on the causal node, rather than lobbying for general sanitary reform or publishing a paper arguing for the germ theory. The intervention was local and immediate. The effect was local and immediate.</w:t>
+      </w:r>
+    </w:p>
+    <w:p>
+      <w:pPr>
+        <w:pStyle w:val="BodyText"/>
+      </w:pPr>
+      <w:r>
+        <w:t xml:space="preserve">The moral physicist is the person who applies this sequence to human suffering rather than to disease. The steps are the same. Identify the pattern that the prevailing explanation does not account for, which is the unsheltered individuals who repeatedly refuse services that the system categorizes as adequate, generating a pattern of failure that the system attributes to the population’s pathology rather than to its own design. Map the pattern at the level of distinct mechanisms, including the neurological destruction of autonomous agency, the institutional classification of defense reflexes as behavioral choices, and the hierarchy inversion that demands performance as a condition of receiving the conditions that make performance possible. Identify the causal node, whereby the warm offer delivered to a person in dorsal-vagal shutdown is an offer delivered to a nervous system that cannot receive it. The pump handle, representing the physical intervention point, is the moment of contact between the outreach worker and the individual, and the manner of that contact determines whether it activates threat response or social engagement.</w:t>
+      </w:r>
+    </w:p>
+    <w:p>
+      <w:pPr>
+        <w:pStyle w:val="BodyText"/>
+      </w:pPr>
+      <w:r>
+        <w:t xml:space="preserve">Remove the pump handle by changing the manner of contact. Train the worker to identify autonomic state. Change the script. Change the approach vector. Change the institutional recording practice that converts a non-response into a refusal. These are physical interventions on a causal chain, not policy positions or advocacy campaigns. They produce observable outcomes in distinct individuals, measurable within ninety days at the level of named contacts, voluntary engagement rates, and housing retention.</w:t>
+      </w:r>
+    </w:p>
+    <w:p>
+      <w:pPr>
+        <w:pStyle w:val="BodyText"/>
+      </w:pPr>
+      <w:r>
+        <w:t xml:space="preserve">Snow did not debate the miasma theory with its defenders. He did not write a policy paper arguing that sanitary reform was necessary. He did not wait for the Board of Guardians to adopt the germ theory before acting. He identified the mechanism, intervened at the causal node, and the deaths stopped. His vindication came from the outcome, not from the debate. The moral physicist’s vindication comes from the same place, namely that the person who was on the dirt is now inside, sleeping, and in six months will be attending the pod council and in twelve months will be considering vocational training. The pump handle is removed. The mechanism has been interrupted. The outcome is the argument.</w:t>
+      </w:r>
+      <w:r>
+        <w:t xml:space="preserve"> </w:t>
+      </w:r>
+      <w:r>
+        <w:t xml:space="preserve"># Chapter 12: The Remnant and the Obligation</w:t>
+      </w:r>
+    </w:p>
+    <w:p>
+      <w:pPr>
+        <w:pStyle w:val="BodyText"/>
+      </w:pPr>
+      <w:r>
+        <w:t xml:space="preserve">Václav Havel wrote</w:t>
+      </w:r>
+      <w:r>
+        <w:t xml:space="preserve"> </w:t>
+      </w:r>
+      <w:r>
+        <w:rPr>
+          <w:iCs/>
+          <w:i/>
+        </w:rPr>
+        <w:t xml:space="preserve">The Power of the Powerless</w:t>
+      </w:r>
+      <w:r>
+        <w:t xml:space="preserve"> </w:t>
+      </w:r>
+      <w:r>
+        <w:t xml:space="preserve">in 1978, in a Czechoslovakia under Soviet normalization, at a moment when every public institution had been occupied by the apparatus of a system that required everyone within it to perform compliance with an official reality that everyone knew was false. The greengrocer puts up the sign,</w:t>
       </w:r>
       <w:r>
         <w:t xml:space="preserve"> </w:t>
@@ -781,16 +1359,155 @@
         <w:t xml:space="preserve">“</w:t>
       </w:r>
       <w:r>
-        <w:t xml:space="preserve">this person is drowning</w:t>
+        <w:t xml:space="preserve">Workers of the World, Unite!</w:t>
       </w:r>
       <w:r>
         <w:t xml:space="preserve">”</w:t>
       </w:r>
       <w:r>
-        <w:t xml:space="preserve"> </w:t>
-      </w:r>
-      <w:r>
-        <w:t xml:space="preserve">to</w:t>
+        <w:t xml:space="preserve">, not because he believes it but because not putting it up would expose him to consequences. The sign is not communication. It is a ritual of participation in a collective lie that keeps the system operational. The system survives, Havel argued, not through sincere belief but through the accumulated weight of everyone’s individual decisions to perform compliance rather than to live in truth.</w:t>
+      </w:r>
+    </w:p>
+    <w:p>
+      <w:pPr>
+        <w:pStyle w:val="BodyText"/>
+      </w:pPr>
+      <w:r>
+        <w:t xml:space="preserve">The power of the powerless, as Havel understood it, lies in the refusal to perform. When the greengrocer takes down the sign, acting as though the official reality is not real, he does something that the system has no protocol for. He becomes a person who has stepped outside the system’s logic, and by doing so reveals that the system’s logic depends on everyone’s participation to sustain it. The act is tiny. Its significance is not in its immediate effect but in what it demonstrates, namely that the system’s apparent inevitability is not inevitability at all. It is the sum of individual choices to comply.</w:t>
+      </w:r>
+    </w:p>
+    <w:p>
+      <w:pPr>
+        <w:pStyle w:val="BodyText"/>
+      </w:pPr>
+      <w:r>
+        <w:t xml:space="preserve">MacIntyre, writing</w:t>
+      </w:r>
+      <w:r>
+        <w:t xml:space="preserve"> </w:t>
+      </w:r>
+      <w:r>
+        <w:rPr>
+          <w:iCs/>
+          <w:i/>
+        </w:rPr>
+        <w:t xml:space="preserve">After Virtue</w:t>
+      </w:r>
+      <w:r>
+        <w:t xml:space="preserve"> </w:t>
+      </w:r>
+      <w:r>
+        <w:t xml:space="preserve">in 1981, describes the same dynamic from a different historical vantage. When moral traditions collapse, meaning when the institutions that embodied and transmitted those traditions are corrupted or destroyed, what survives is the remnant, representing the people who continue to practice the virtues of the tradition in small communities, outside the dominant institutional structure, keeping the intellectual and moral forms alive through the period of darkness. MacIntyre ends</w:t>
+      </w:r>
+      <w:r>
+        <w:t xml:space="preserve"> </w:t>
+      </w:r>
+      <w:r>
+        <w:rPr>
+          <w:iCs/>
+          <w:i/>
+        </w:rPr>
+        <w:t xml:space="preserve">After Virtue</w:t>
+      </w:r>
+      <w:r>
+        <w:t xml:space="preserve"> </w:t>
+      </w:r>
+      <w:r>
+        <w:t xml:space="preserve">with a famous sentence, noting that we are waiting not for a Godot, but for another, doubtless very different, St. Benedict. He is waiting for the person who will build the new communities that carry the tradition through to the next period when it can be rebuilt at scale.</w:t>
+      </w:r>
+    </w:p>
+    <w:p>
+      <w:pPr>
+        <w:pStyle w:val="BodyText"/>
+      </w:pPr>
+      <w:r>
+        <w:t xml:space="preserve">The remnant in this book is not a religious category. It is a functional one. The remnant consists of the people who refuse to look away from what the street is doing to Arthur, maintaining the accurate account, as Havel put it, in the face of a system that requires performance of a different account. The system’s account says that Arthur declined services, that he is a non-compliant refuser, and that the system acted appropriately. The accurate account says that Arthur’s nervous system was in dorsal-vagal shutdown, that his autonomic state was misread as a behavioral choice, and that the system recorded a category error as an outcome and drove away. These two accounts are not minor variations. They are incompatible descriptions of the same event, with incompatible moral implications.</w:t>
+      </w:r>
+    </w:p>
+    <w:p>
+      <w:pPr>
+        <w:pStyle w:val="BodyText"/>
+      </w:pPr>
+      <w:r>
+        <w:t xml:space="preserve">The remnant carries the accurate account during the period when institutions will not. This function is not dramatic. It consists mostly of showing up, repeatedly, to the same location, at the same time, with the same offering, and asking the same question, namely if the individual needs anything. It consists of learning someone’s name and using it. Remembering what they asked for last week. Returning with what you promised. Writing things down accurately and reporting what you saw rather than what the form asks for. These acts are small. Their cumulative effect is the slow accumulation of a body of witness, representing an evidentiary record of what is happening to particular people in distinct locations, that becomes available to act on when the political window opens.</w:t>
+      </w:r>
+    </w:p>
+    <w:p>
+      <w:pPr>
+        <w:pStyle w:val="BodyText"/>
+      </w:pPr>
+      <w:r>
+        <w:t xml:space="preserve">The obligation created by witnessing is not delegable. This is the point on which the remnant’s moral position differs from that of the advocate or the reformer. An advocate can represent the interests of a population they have never met. A reformer can design policy for people they have only encountered in data. The witness has seen the particular person. The witness knows Arthur’s face and the way he holds his plastic crate and the fact that he has not eaten today and the fact that his cough has gotten worse. This individual knowledge generates an obligation that cannot be transferred to an institution or a program or a grant application. The institution can process Arthur. Only the witness knows Arthur.</w:t>
+      </w:r>
+    </w:p>
+    <w:p>
+      <w:pPr>
+        <w:pStyle w:val="BodyText"/>
+      </w:pPr>
+      <w:r>
+        <w:t xml:space="preserve">Havel did not survive the Soviet period because he was powerful. He survived because he maintained the accurate account at enormous personal cost, through imprisonment and harassment and the suppression of his work, and when the system collapsed, which it did within eleven years of</w:t>
+      </w:r>
+      <w:r>
+        <w:t xml:space="preserve"> </w:t>
+      </w:r>
+      <w:r>
+        <w:rPr>
+          <w:iCs/>
+          <w:i/>
+        </w:rPr>
+        <w:t xml:space="preserve">The Power of the Powerless</w:t>
+      </w:r>
+      <w:r>
+        <w:t xml:space="preserve"> </w:t>
+      </w:r>
+      <w:r>
+        <w:t xml:space="preserve">being circulated in samizdat, he was the person who was ready, having the moral clarity and the sustained witness of what the system had done, to act in the political window that opened. The remnant’s function is to be that person, in that moment, for the people on the street.</w:t>
+      </w:r>
+    </w:p>
+    <w:p>
+      <w:pPr>
+        <w:pStyle w:val="BodyText"/>
+      </w:pPr>
+      <w:r>
+        <w:t xml:space="preserve">The obligation does not promise that the window will come soon. It does not promise that the remnant’s witnessing will produce the system change that Arthur needs. What it promises is that the accurate account will exist, maintained by dedicated people who refused to look away, and that when the political conditions change, which they will because the conditions that produce chronic mass homelessness at this scale are not stable, there will be people who know what to build, because they have been watching the mechanism for long enough to understand where the pump handle is.</w:t>
+      </w:r>
+      <w:r>
+        <w:t xml:space="preserve"> </w:t>
+      </w:r>
+      <w:r>
+        <w:t xml:space="preserve"># Chapter 13: A Different Starting Point</w:t>
+      </w:r>
+    </w:p>
+    <w:p>
+      <w:pPr>
+        <w:pStyle w:val="BodyText"/>
+      </w:pPr>
+      <w:r>
+        <w:t xml:space="preserve">What would we have built if we had started with the right philosophy?</w:t>
+      </w:r>
+    </w:p>
+    <w:p>
+      <w:pPr>
+        <w:pStyle w:val="BodyText"/>
+      </w:pPr>
+      <w:r>
+        <w:t xml:space="preserve">This is not a rhetorical question. Philosophy has operational consequences. The conceptual tools a society uses to understand what a person is determine what it builds to address human need. Get the philosophy wrong and you build the wrong system, measure the wrong things, fund the wrong institutions, and produce the wrong outcomes while maintaining confidence in the correctness of your approach. California spent twenty-four billion dollars with confidence. The philosophy was wrong from the beginning.</w:t>
+      </w:r>
+    </w:p>
+    <w:p>
+      <w:pPr>
+        <w:pStyle w:val="BodyText"/>
+      </w:pPr>
+      <w:r>
+        <w:t xml:space="preserve">The correct starting point is the biological floor. Before any theory of rights, before any structure of justice, before any question about what individuals owe each other or what institutions owe individuals, there is the physical fact of a human body that requires particular conditions to remain capable of anything else. Sleep, food, temperature regulation, acoustic protection, and the neurological decompression that only follows when these needs are reliably met are not policy preferences. They are the preconditions for everything the social contract assumes the individual can do. A rights structure that does not establish the biological floor first is built on an assumption about the person it is reasoning about that the chronically unsheltered population defeats by existing.</w:t>
+      </w:r>
+    </w:p>
+    <w:p>
+      <w:pPr>
+        <w:pStyle w:val="BodyText"/>
+      </w:pPr>
+      <w:r>
+        <w:t xml:space="preserve">Starting from the biological floor produces a different architecture. The first institutional question is not</w:t>
       </w:r>
       <w:r>
         <w:t xml:space="preserve"> </w:t>
@@ -799,7 +1516,7 @@
         <w:t xml:space="preserve">“</w:t>
       </w:r>
       <w:r>
-        <w:t xml:space="preserve">you should save them.</w:t>
+        <w:t xml:space="preserve">what services does this person need?</w:t>
       </w:r>
       <w:r>
         <w:t xml:space="preserve">”</w:t>
@@ -808,15 +1525,7 @@
         <w:t xml:space="preserve"> </w:t>
       </w:r>
       <w:r>
-        <w:t xml:space="preserve">The logic gap between the descriptive and the prescriptive, Hume argued, is not nothing. It requires a bridge, and most moral philosophy builds the bridge without acknowledging that they are building it.</w:t>
-      </w:r>
-    </w:p>
-    <w:p>
-      <w:pPr>
-        <w:pStyle w:val="BodyText"/>
-      </w:pPr>
-      <w:r>
-        <w:t xml:space="preserve">This matters for the argument of this book because the argument’s most important move is the one Hume identified as requiring justification. The argument moves from</w:t>
+        <w:t xml:space="preserve">but</w:t>
       </w:r>
       <w:r>
         <w:t xml:space="preserve"> </w:t>
@@ -825,7 +1534,7 @@
         <w:t xml:space="preserve">“</w:t>
       </w:r>
       <w:r>
-        <w:t xml:space="preserve">Arthur’s brain has been physically damaged by chronic street exposure</w:t>
+        <w:t xml:space="preserve">what does this person’s nervous system require before they can use any service?</w:t>
       </w:r>
       <w:r>
         <w:t xml:space="preserve">”</w:t>
@@ -834,707 +1543,55 @@
         <w:t xml:space="preserve"> </w:t>
       </w:r>
       <w:r>
-        <w:t xml:space="preserve">to</w:t>
-      </w:r>
-      <w:r>
-        <w:t xml:space="preserve"> </w:t>
-      </w:r>
-      <w:r>
-        <w:t xml:space="preserve">“</w:t>
-      </w:r>
-      <w:r>
-        <w:t xml:space="preserve">there is an obligation to intervene on his behalf.</w:t>
-      </w:r>
-      <w:r>
-        <w:t xml:space="preserve">”</w:t>
-      </w:r>
-      <w:r>
-        <w:t xml:space="preserve"> </w:t>
-      </w:r>
-      <w:r>
-        <w:t xml:space="preserve">The factual claim is well-supported; the neuroscience is documented, the mechanism is understood, and the behavioral indicators are observable. The normative claim is what needs defending.</w:t>
-      </w:r>
-    </w:p>
-    <w:p>
-      <w:pPr>
-        <w:pStyle w:val="BodyText"/>
-      </w:pPr>
-      <w:r>
-        <w:t xml:space="preserve">Most contemporary moral philosophy defends it by appeal to social contract or rights theory. The social contract states that we have collectively agreed to protect each other, and Arthur is part of the collective whose protection that agreement entails. Rights theory argues that Arthur has a right to life, which generates an obligation on others not to allow preventable death. John Rawls constructs a more elaborate version, proposing that a just society is one whose principles we would choose from behind a veil of ignorance, not knowing whether we would emerge as Arthur or as one of the outreach workers who drove away. From that position we would choose a society that rescues Arthur rather than leaves him on the dirt.</w:t>
-      </w:r>
-    </w:p>
-    <w:p>
-      <w:pPr>
-        <w:pStyle w:val="BodyText"/>
-      </w:pPr>
-      <w:r>
-        <w:t xml:space="preserve">Each of these bridges works. Each also has the problem that Hume was pointing at, namely that they bring in background commitments, including the existence and bindingness of the social contract, the metaphysics of rights, and the procedural fairness of the Rawlsian construction, that themselves require justification and that a determined skeptic can always find reasons to contest. The rights of the homeless are contested politically. The scope of the social contract is contested legally. The Rawlsian veil of ignorance is contested philosophically. The bridge, built from these materials, is always one contested premise away from collapse.</w:t>
-      </w:r>
-    </w:p>
-    <w:p>
-      <w:pPr>
-        <w:pStyle w:val="BodyText"/>
-      </w:pPr>
-      <w:r>
-        <w:t xml:space="preserve">Foot’s natural goodness system, explored in the previous chapter, offers a different kind of bridge. For a biological organism, the evaluative judgment follows from the descriptive one through the concept of species-characteristic functioning. When we describe the destruction of Arthur’s prefrontal cortex, we are not describing a morally neutral physiological event. We are describing the impairment of functions that are constitutive of what it is to be a human being living well. The</w:t>
-      </w:r>
-      <w:r>
-        <w:t xml:space="preserve"> </w:t>
-      </w:r>
-      <w:r>
-        <w:t xml:space="preserve">“</w:t>
-      </w:r>
-      <w:r>
-        <w:t xml:space="preserve">ought</w:t>
-      </w:r>
-      <w:r>
-        <w:t xml:space="preserve">”</w:t>
-      </w:r>
-      <w:r>
-        <w:t xml:space="preserve"> </w:t>
-      </w:r>
-      <w:r>
-        <w:t xml:space="preserve">follows from the</w:t>
-      </w:r>
-      <w:r>
-        <w:t xml:space="preserve"> </w:t>
-      </w:r>
-      <w:r>
-        <w:t xml:space="preserve">“</w:t>
-      </w:r>
-      <w:r>
-        <w:t xml:space="preserve">is</w:t>
-      </w:r>
-      <w:r>
-        <w:t xml:space="preserve">”</w:t>
-      </w:r>
-      <w:r>
-        <w:t xml:space="preserve"> </w:t>
-      </w:r>
-      <w:r>
-        <w:t xml:space="preserve">through the concept of natural function, without requiring any social contract, any metaphysical rights claim, or any procedural construction. Organisms of this kind require these conditions. The conditions have been destroyed. The destruction is bad relative to what the organism is. The obligation to restore the conditions follows from the nature of the organism.</w:t>
-      </w:r>
-    </w:p>
-    <w:p>
-      <w:pPr>
-        <w:pStyle w:val="BodyText"/>
-      </w:pPr>
-      <w:r>
-        <w:t xml:space="preserve">John Searle’s work on institutional facts suggests a second bridge, operating differently. Searle argues that particular facts about the world are not natural facts alone but institutional ones, existing because of human practices and agreements that make them real. The fact that Arthur has been</w:t>
-      </w:r>
-      <w:r>
-        <w:t xml:space="preserve"> </w:t>
-      </w:r>
-      <w:r>
-        <w:t xml:space="preserve">“</w:t>
-      </w:r>
-      <w:r>
-        <w:t xml:space="preserve">refused</w:t>
-      </w:r>
-      <w:r>
-        <w:t xml:space="preserve">”</w:t>
-      </w:r>
-      <w:r>
-        <w:t xml:space="preserve"> </w:t>
-      </w:r>
-      <w:r>
-        <w:t xml:space="preserve">services is an institutional fact. The outreach team’s tablet generated a record that categorized the contact outcome as</w:t>
-      </w:r>
-      <w:r>
-        <w:t xml:space="preserve"> </w:t>
-      </w:r>
-      <w:r>
-        <w:t xml:space="preserve">“</w:t>
-      </w:r>
-      <w:r>
-        <w:t xml:space="preserve">client decline</w:t>
-      </w:r>
-      <w:r>
-        <w:t xml:space="preserve">”</w:t>
-      </w:r>
-      <w:r>
-        <w:t xml:space="preserve"> </w:t>
-      </w:r>
-      <w:r>
-        <w:t xml:space="preserve">and that this categorization will follow Arthur through the service system and affect what he is offered in the future. That institutional fact was constructed from a natural fact, Arthur did not respond, through a set of institutional practices that interpreted non-response as refusal. Searle’s analysis makes visible that this construction is a choice, not a finding. The natural fact is that Arthur’s nervous system did not engage with the offer. The institutional fact is that Arthur declined. Between these two facts lies a moral decision that the system made without acknowledging that it was making one.</w:t>
-      </w:r>
-    </w:p>
-    <w:p>
-      <w:pPr>
-        <w:pStyle w:val="BodyText"/>
-      </w:pPr>
-      <w:r>
-        <w:t xml:space="preserve">The is-ought gap, for this book’s argument, is closed by the convergence of these two approaches. The natural goodness system establishes that facts about biological impairment carry evaluative content intrinsically, as they are bad relative to the organism’s nature, and that badness generates prescriptive force without requiring an external moral construct. The institutional facts analysis establishes that the categorization of Arthur’s non-response as a refusal is itself a moral act, performed under the cover of administrative neutrality, that the system must be accountable for. Together they produce a claim that Hume’s gap is real but crossable, not by smuggling in a hidden normative premise, but by recognizing that the natural world contains organisms whose nature is itself evaluatively rich, and that the human organism is one of them.</w:t>
-      </w:r>
-    </w:p>
-    <w:p>
-      <w:pPr>
-        <w:pStyle w:val="BodyText"/>
-      </w:pPr>
-      <w:r>
-        <w:t xml:space="preserve">To describe Arthur’s condition fully and accurately is not to issue a neutral report. It is to document what has been done to a human being and what must be done in response. The witness statement and the moral demand are the same document.</w:t>
-      </w:r>
-      <w:r>
-        <w:t xml:space="preserve"> </w:t>
-      </w:r>
-      <w:r>
-        <w:t xml:space="preserve"># Chapter 6: The Social Contract’s Hidden Assumption</w:t>
-      </w:r>
-    </w:p>
-    <w:p>
-      <w:pPr>
-        <w:pStyle w:val="BodyText"/>
-      </w:pPr>
-      <w:r>
-        <w:t xml:space="preserve">Every version of social contract theory begins with a gathering. Hobbes’s contractors emerge from the state of nature, calculating rational actors who agree to submit to sovereign authority because the alternative, the war of all against all, is worse than any arrangement the sovereign imposes. Locke’s contractors bring their natural rights into the compact and reserve them against government overreach. Rawls’s contractors deliberate behind a veil of ignorance, designing principles of justice without knowing their own position in the society those principles will govern.</w:t>
-      </w:r>
-    </w:p>
-    <w:p>
-      <w:pPr>
-        <w:pStyle w:val="BodyText"/>
-      </w:pPr>
-      <w:r>
-        <w:t xml:space="preserve">Arthur cannot attend any of these gatherings. He cannot calculate, because calculation requires the prefrontal function that the street has impaired. He cannot bring his rights to bear, because the institutional mechanisms through which rights are asserted require legal standing, documentation, and the capacity to navigate the processes through which standing is claimed. He cannot deliberate behind a veil of ignorance, because deliberation requires the cognitive architecture that two winters of cortisol saturation have degraded. The social contract, in each of its historical formulations, is built for participants who arrive capable. Arthur does not arrive capable.</w:t>
-      </w:r>
-    </w:p>
-    <w:p>
-      <w:pPr>
-        <w:pStyle w:val="BodyText"/>
-      </w:pPr>
-      <w:r>
-        <w:t xml:space="preserve">This is not an incidental feature of social contract theory. It is constitutive. The contract is designed to solve a particular problem, namely how rational actors who recognize each other’s capacity for reciprocal harm and benefit can establish stable cooperation. The logic of the contract depends on each party being a potential threat and a potential benefit to the others, representing someone whose agreement is worth securing because their violation of the agreement would cost something. A person who cannot threaten, cannot promise, cannot reciprocate, and cannot negotiate is not a party to the contract in any meaningful sense. They are what Rawls called an</w:t>
-      </w:r>
-      <w:r>
-        <w:t xml:space="preserve"> </w:t>
-      </w:r>
-      <w:r>
-        <w:t xml:space="preserve">“</w:t>
-      </w:r>
-      <w:r>
-        <w:t xml:space="preserve">outside</w:t>
-      </w:r>
-      <w:r>
-        <w:t xml:space="preserve">”</w:t>
-      </w:r>
-      <w:r>
-        <w:t xml:space="preserve"> </w:t>
-      </w:r>
-      <w:r>
-        <w:t xml:space="preserve">case, meaning someone for whom the contract’s principles generate no obligations because they are not parties to the original agreement.</w:t>
-      </w:r>
-    </w:p>
-    <w:p>
-      <w:pPr>
-        <w:pStyle w:val="BodyText"/>
-      </w:pPr>
-      <w:r>
-        <w:t xml:space="preserve">Rawls acknowledged this problem and attempted to address it in later work, arguing that the extension of justice to those who cannot participate in the original position, including people with severe cognitive disabilities, requires a separate theoretical treatment. He was right that it requires separate treatment. He did not finish that treatment, and the gap he identified is the gap that Arthur falls through in every city that has deployed Rawlsian-adjacent policy systems to govern its homelessness programs. The programs are designed to be fair to participants. Arthur is not a participant.</w:t>
-      </w:r>
-    </w:p>
-    <w:p>
-      <w:pPr>
-        <w:pStyle w:val="BodyText"/>
-      </w:pPr>
-      <w:r>
-        <w:t xml:space="preserve">Hobbes’s version of the problem is more brutal and more honest. In Leviathan, those who cannot protect themselves are not protected by the social compact because they have nothing to offer the compact in exchange for its protections. They exist in a permanent state of nature relative to the rest of society. The sovereign has no obligation to them derived from contract. Whatever obligations the sovereign might have are moral obligations that exist prior to and independent of the contract itself. Hobbes has no developed account of those prior obligations, which is why his theory produces a state that can legitimately ignore Arthur, as long as it does not commit harm against him.</w:t>
-      </w:r>
-    </w:p>
-    <w:p>
-      <w:pPr>
-        <w:pStyle w:val="BodyText"/>
-      </w:pPr>
-      <w:r>
-        <w:t xml:space="preserve">The gap is real and must be acknowledged rather than papered over. Social contract theory, in its standard formulations, does not generate obligations toward Arthur. Nussbaum, in Creating Capabilities, is clear about this, noting that her capabilities approach was developed partly to address the population that contract theory excludes. The capabilities approach does not derive obligation from a hypothetical agreement. It derives obligation from the observable fact that particular capabilities are constitutive of a genuinely human life, and that a just society has an affirmative duty to bring every person above the threshold of those capabilities. This derivation does not require Arthur’s participation. It requires only that he is a human being, which is a fact about him that the street has not changed.</w:t>
-      </w:r>
-    </w:p>
-    <w:p>
-      <w:pPr>
-        <w:pStyle w:val="BodyText"/>
-      </w:pPr>
-      <w:r>
-        <w:t xml:space="preserve">The political implication is that the state’s obligation to Arthur does not rest on the same foundation as its obligation to taxpaying, voting, contracting citizens. It rests on a prior foundation, which is the natural law obligation to protect the conditions required for any human being to function as a human being, prior to and independent of any contractual relationship. This is not a novel claim in Western political philosophy. Cicero established it in De Re Publica. The Stoics grounded it in the common logos that all rational beings share. Grotius developed it into the foundational principle of international law, arguing that particular obligations hold between persons independent of any treaty, compact, or mutual agreement, because the nature of persons generates them.</w:t>
-      </w:r>
-    </w:p>
-    <w:p>
-      <w:pPr>
-        <w:pStyle w:val="BodyText"/>
-      </w:pPr>
-      <w:r>
-        <w:t xml:space="preserve">What is novel is applying this pre-contractual obligation to the particular population that modern liberal states have created through the combination of housing scarcity, inadequate mental health infrastructure, and service systems structured to serve participants rather than to rescue the incapacitated. The traditional natural law systems were not designed for this population, because this population, chronically unsheltered, neurologically impaired by years of street exposure, and classified as non-compliant by the systems nominally responsible for their care, did not exist at the scale it exists now. The obligation is pre-modern. The population it must address is a consequence of modern conditions. The intersection of the two is what this book is about.</w:t>
-      </w:r>
-      <w:r>
-        <w:t xml:space="preserve"> </w:t>
-      </w:r>
-      <w:r>
-        <w:t xml:space="preserve"># Chapter 7: Natural Law Without God</w:t>
-      </w:r>
-    </w:p>
-    <w:p>
-      <w:pPr>
-        <w:pStyle w:val="BodyText"/>
-      </w:pPr>
-      <w:r>
-        <w:t xml:space="preserve">Hugo Grotius wrote, in 1625, a sentence that changed the history of political philosophy. He argued that the law of nations would hold</w:t>
-      </w:r>
-      <w:r>
-        <w:t xml:space="preserve"> </w:t>
-      </w:r>
-      <w:r>
-        <w:t xml:space="preserve">“</w:t>
-      </w:r>
-      <w:r>
-        <w:t xml:space="preserve">even if we were to concede, what without the greatest wickedness cannot be conceded, that there is no God.</w:t>
-      </w:r>
-      <w:r>
-        <w:t xml:space="preserve">”</w:t>
-      </w:r>
-      <w:r>
-        <w:t xml:space="preserve"> </w:t>
-      </w:r>
-      <w:r>
-        <w:t xml:space="preserve">The Latin phrase, etiamsi daremus non esse Deum, has been called the founding claim of secular natural law. What Grotius was asserting is that some moral obligations are grounded in the nature of things, not in divine command, and that you can recognize them without reference to God at all.</w:t>
-      </w:r>
-    </w:p>
-    <w:p>
-      <w:pPr>
-        <w:pStyle w:val="BodyText"/>
-      </w:pPr>
-      <w:r>
-        <w:t xml:space="preserve">This matters for the argument of this book because the natural law tradition is the philosophical model that most naturally supports what this book is claiming, which is that Arthur’s biological condition generates an obligation to intervene that does not depend on his consent, his contract membership, or his cognitive performance, and because that tradition has historically been entangled with theological premises making it inaccessible to secular political discourse. A secular natural law argument is the one that can be heard across the widest range of the political landscape. Here is that argument.</w:t>
-      </w:r>
-    </w:p>
-    <w:p>
-      <w:pPr>
-        <w:pStyle w:val="BodyText"/>
-      </w:pPr>
-      <w:r>
-        <w:t xml:space="preserve">Cicero, writing in De Re Publica three centuries before Christianity, grounded law in the rational nature that all human beings share. True law, he wrote, is right reason in agreement with nature, meaning it is universal, unchanging, and binding on all nations and all times. Its source is not a legislature, not a custom, not a divine promulgation. It is the nature of the rational creature itself. Because all human beings share this rational nature, they share in a universal moral community whose obligations do not depend on citizenship, agreement, or institutional membership. The slave and the senator are both members of the same rational community. The obligation to treat them both as ends rather than as instruments follows from their shared participation in reason.</w:t>
-      </w:r>
-    </w:p>
-    <w:p>
-      <w:pPr>
-        <w:pStyle w:val="BodyText"/>
-      </w:pPr>
-      <w:r>
-        <w:t xml:space="preserve">Marcus Aurelius, a practicing Stoic writing four centuries after Cicero, pushed this further. The Stoic doctrine of cosmopolitanism, which holds that all rational beings belong to a single world-city whose laws are the laws of reason, generated obligations toward the suffering of strangers. In the Meditations, Aurelius returns repeatedly to the theme that what harms the hive harms the bee, meaning that the good of any rational being is the concern of every rational being, not because of a contractual arrangement but because rationality itself is the shared medium through which all of them participate in the universe’s ordering principle. The suffering of one diminishes all.</w:t>
-      </w:r>
-    </w:p>
-    <w:p>
-      <w:pPr>
-        <w:pStyle w:val="BodyText"/>
-      </w:pPr>
-      <w:r>
-        <w:t xml:space="preserve">Neither Cicero nor Aurelius grounded this in God. Cicero’s cosmic reason is immanent in nature. Aurelius’s logos is the rational structure of the cosmos itself, not a personal deity who commands obedience. Grotius, drawing on both, made the secularity clear, stating that the natural law holds whether God exists or not, because it is grounded in the nature of things rather than in divine will.</w:t>
-      </w:r>
-    </w:p>
-    <w:p>
-      <w:pPr>
-        <w:pStyle w:val="BodyText"/>
-      </w:pPr>
-      <w:r>
-        <w:t xml:space="preserve">The biological version of this argument is the one this book needs. Human beings are organisms of a particular kind. That kind has characteristic needs, including sleep, nutrition, physical safety, metabolic stability, and the neurological decompression that follows when these needs are reliably met. These needs are not preferences or cultural constructions. They are biological facts about what kind of organism a human being is. When an environment systematically destroys the capacity to meet these needs, as chronic street exposure does, it destroys the conditions required for the organism to function as the kind of organism it is. The destruction is bad relative to the organism’s nature. The obligation to prevent that destruction, and to restore the conditions when destruction has occurred, follows from the nature of the organism, not from God, not from a social contract, not from a rights claim, but from the observable fact of what a human being requires to be a human being.</w:t>
-      </w:r>
-    </w:p>
-    <w:p>
-      <w:pPr>
-        <w:pStyle w:val="BodyText"/>
-      </w:pPr>
-      <w:r>
-        <w:t xml:space="preserve">Philippa Foot, as Chapter 4 established, provides the contemporary philosophical model that closes this argument. Natural goodness is not a property conferred by social membership or divine grace. It is a property of organisms relative to their kind, derivable from observation of what characterizes the life of organisms of that kind when they are living it well. A human being living well is sleeping, eating, connected to others, capable of deliberate action, and oriented toward a future. Arthur under the bridge is none of these things. His condition is bad relative to what he is, and the badness generates prescriptive force, creating an obligation to restore the conditions, without any theological premise in the argument.</w:t>
-      </w:r>
-    </w:p>
-    <w:p>
-      <w:pPr>
-        <w:pStyle w:val="BodyText"/>
-      </w:pPr>
-      <w:r>
-        <w:t xml:space="preserve">The secular natural law argument reaches a policy audience that the theological natural law argument does not, and it reaches it without sacrificing the philosophical rigor that the biological floor claim requires. The obligation to rescue Arthur is not a religious obligation. It is an obligation grounded in what Arthur is, which is a member of the rational animal species whose nature includes the needs that street exposure destroys and whose good, in Cicero’s formulation, is the concern of every other member of that species by virtue of their shared participation in the same kind of life.</w:t>
-      </w:r>
-      <w:r>
-        <w:t xml:space="preserve"> </w:t>
-      </w:r>
-      <w:r>
-        <w:t xml:space="preserve"># Chapter 8: The Hierarchy of Obligation</w:t>
-      </w:r>
-    </w:p>
-    <w:p>
-      <w:pPr>
-        <w:pStyle w:val="BodyText"/>
-      </w:pPr>
-      <w:r>
-        <w:t xml:space="preserve">Some obligations are prior to others. This is not a political claim about priorities or a budgetary claim about sequencing. It is a logical claim, meaning some things must be in place before other things are possible, and demanding the latter before establishing the former is a category error that produces the failure that California documented when it spent twenty-four billion dollars and the population grew.</w:t>
-      </w:r>
-    </w:p>
-    <w:p>
-      <w:pPr>
-        <w:pStyle w:val="BodyText"/>
-      </w:pPr>
-      <w:r>
-        <w:t xml:space="preserve">Amartya Sen’s development model establishes the logical structure. Sen argues that human development is not a matter of providing resources but of expanding capabilities, which represent the real freedoms that people have reason to value and the ability to exercise them. These capabilities are not independent of each other. They form a hierarchy in which some are preconditions for others. Bodily health and physical integrity are primary. Practical reason, representing the capacity to deliberate, plan, and form a conception of the good, is built on top of that foundation. Affiliation, participation in community life, and control over one’s social and political environment are built on top of practical reason. The sequence is not arbitrary. Each capability is the precondition for the ones above it.</w:t>
-      </w:r>
-    </w:p>
-    <w:p>
-      <w:pPr>
-        <w:pStyle w:val="BodyText"/>
-      </w:pPr>
-      <w:r>
-        <w:t xml:space="preserve">Arthur, under the bridge, has lost access to the primary tier. His bodily health has been degraded by cold, malnutrition, and the cumulative stress of years without adequate shelter. His physical integrity is violated by every sweep operation that destroys his possessions and displaces him. Without the primary tier, practical reason is unavailable to him, and without practical reason, all the affiliation programming, the vocational training, the case management sessions, and the behavior contracts that the system offers are offering the third tier to someone who has lost access to the first.</w:t>
-      </w:r>
-    </w:p>
-    <w:p>
-      <w:pPr>
-        <w:pStyle w:val="BodyText"/>
-      </w:pPr>
-      <w:r>
-        <w:t xml:space="preserve">This is the hierarchy inversion that defines the American system’s failure mode. The system demands participation in higher-tier programs as a condition of access to basic resources. To receive shelter, Arthur must sign a behavior contract, which requires practical reason. To receive case management, he must attend appointments, which requires the executive function to maintain a schedule. To access supportive housing, he must demonstrate housing readiness, which requires the cognitive architecture that street exposure has progressively impaired. The system’s eligibility requirements are tier-three demands imposed on a person who has been stripped to tier one. They do not filter for housing readiness. They filter out the most damaged, who are also the most urgently in need.</w:t>
-      </w:r>
-    </w:p>
-    <w:p>
-      <w:pPr>
-        <w:pStyle w:val="BodyText"/>
-      </w:pPr>
-      <w:r>
-        <w:t xml:space="preserve">Phase Zero in the Material Dignity Infrastructure, abbreviated as MDI, is a response to this inversion. This clinical-housing model, detailed in the author’s street-to-home pipeline analysis, structures intervention through three non-discretionary stages. Phase Zero establishes the biological floor unconditionally, providing shelter, nutrition, medical stabilization, and the ninety-day decompression period during which sleep restores, cortisol drops, and the prefrontal systems that make everything else possible begin to recover. No compliance requirement. No behavior contract. No assessment of housing readiness. The organism is stabilized first. Everything the organization wants to assess can happen after the organism is ready, because the biological conditions for valid assessment have been met.</w:t>
-      </w:r>
-    </w:p>
-    <w:p>
-      <w:pPr>
-        <w:pStyle w:val="BodyText"/>
-      </w:pPr>
-      <w:r>
-        <w:t xml:space="preserve">The transition from Phase Zero to the relational layer is the second level of the hierarchy. Once the biological floor is established, the relational environment determines whether the biological stabilization converts into recovery or relocates the person from a street survival loop to a building survival loop. This is the layer that the Finnish system designed for and the American system ignored. The housing advisor, the pod steward, the daily kitchen encounter, and the community council are not amenities or program components. They are the second tier of a hierarchical architecture, available to the organism only because the first tier has been established.</w:t>
-      </w:r>
-    </w:p>
-    <w:p>
-      <w:pPr>
-        <w:pStyle w:val="BodyText"/>
-      </w:pPr>
-      <w:r>
-        <w:t xml:space="preserve">The third tier, comprising identity reconstruction, employment, education, and civic participation, becomes available after the second tier has had sufficient time to produce the relational ground in which identity capital accumulates. Klodnick and Samuels’s 2020 longitudinal research establishes that the first year post-housing is the critical window for this accumulation. The person who arrives at that window having spent ninety days on biological decompression and six months in a relational environment that provides recognition, routine, and community governance arrives with the neurological capacity to use the vocational programming, the digital access center, and the tenancy bridge guarantee. The person who was housed without the first two tiers arrives at that window with a nervous system still calibrated to threat, in a building that provides a lock and a bed and nothing else, and the vocational programming does not engage because the organism is not yet capable of engaging it.</w:t>
-      </w:r>
-    </w:p>
-    <w:p>
-      <w:pPr>
-        <w:pStyle w:val="BodyText"/>
-      </w:pPr>
-      <w:r>
-        <w:t xml:space="preserve">This biological and relational progression maps to the CalAIM service billing tranches. The initial recuperative care rate of twenty-one thousand nine hundred dollars per unit stabilizes the biological floor during decompression. Once the individual transitions, the tenancy sustaining code of fourteen thousand four hundred dollars and the housing navigation code of eight thousand four hundred dollars fund the relational layer. The stabilized blended average of eighteen thousand two hundred dollars per unit sustains the whole hierarchy of care, proving that the operational sequence determines the fiscal sustainability.</w:t>
-      </w:r>
-    </w:p>
-    <w:p>
-      <w:pPr>
-        <w:pStyle w:val="BodyText"/>
-      </w:pPr>
-      <w:r>
-        <w:t xml:space="preserve">Sen’s insight, transposed into the MDI architectural logic, produces a single diagnostic principle, namely that the sequence determines the outcome. A system that provides the right resources in the wrong order will produce the wrong outcome reliably and expensively, and will attribute the failure to the population’s pathology rather than to the sequence error. This is what California has been doing for thirty years. The hierarchy of obligation is not a philosophical nicety. It is the engineering specification for a system that works.</w:t>
-      </w:r>
-      <w:r>
-        <w:t xml:space="preserve"> </w:t>
-      </w:r>
-      <w:r>
-        <w:t xml:space="preserve"># Chapter 9: Institutional Capture and Moral Responsibility</w:t>
-      </w:r>
-    </w:p>
-    <w:p>
-      <w:pPr>
-        <w:pStyle w:val="BodyText"/>
-      </w:pPr>
-      <w:r>
-        <w:t xml:space="preserve">Hannah Arendt did not write about the Los Angeles homeless services industry. She wrote about the trial of Adolf Eichmann, the bureaucrat who coordinated the logistics of mass murder and who, in the dock, displayed no malice, no ideology, and no apparent awareness that he had done anything other than his job. Arendt called this the banality of evil, by which she meant that ordinary institutional behavior, executed without moral reflection by ordinary people following ordinary procedures, can produce catastrophic outcomes that no individual within the system intends or acknowledges. You do not need villains to generate atrocity. You need incentive structures, division of responsibility, and the professional norm of not looking too hard at what the system is producing.</w:t>
-      </w:r>
-    </w:p>
-    <w:p>
-      <w:pPr>
-        <w:pStyle w:val="BodyText"/>
-      </w:pPr>
-      <w:r>
-        <w:t xml:space="preserve">California’s homelessness services apparatus does not produce atrocity in Arendt’s sense. It produces a different kind of outcome that shares the same mechanism. Thousands of people work within it every day with genuine intention to help. They are case managers, outreach workers, shelter operators, county administrators, and grant writers. They care about the population they serve. They also operate within an incentive structure that rewards activity over outcomes, measures contacts over stability, and allocates funding based on the number of individuals processed rather than the number of individuals housed. Within that structure, the system works exactly as designed. Arthur remains on the street. The reports are filed. No one is responsible.</w:t>
-      </w:r>
-    </w:p>
-    <w:p>
-      <w:pPr>
-        <w:pStyle w:val="BodyText"/>
-      </w:pPr>
-      <w:r>
-        <w:t xml:space="preserve">James Buchanan and Gordon Tullock described this mechanism in 1962, before the modern homelessness industry existed. Their analysis of bureaucratic behavior identified a predictable pattern, whereby public agencies expand their budgets, protect their jurisdictions, and embed their operational models into the regulatory standards that new entrants must satisfy. Not from corruption, but from the logic of institutional self-preservation. An agency whose budget is justified by the number of clients it serves has a structural disincentive to reduce the number of clients it serves. This is not a cynical observation about human nature. It is a description of how incentive structures shape behavior in any organization, public or private. The homelessness services industry is not exceptional in this regard. It is an ordinary institutional response to a misaligned principal-agent relationship.</w:t>
-      </w:r>
-    </w:p>
-    <w:p>
-      <w:pPr>
-        <w:pStyle w:val="BodyText"/>
-      </w:pPr>
-      <w:r>
-        <w:t xml:space="preserve">Tyler Cowen’s diagnosis of American institutional stagnation adds a layer to this picture. Regulatory accumulation, as Cowen documents, produces a kind of civilizational complacency in which the existing arrangement becomes self-reinforcing, meaning that existing providers capture the procurement process, write the compliance standards, and use those standards to block alternatives that would reduce their market share. The homelessness services industry exhibits this pattern with precision. The credentialing requirements for service providers, the HMIS data ownership structures, and the county behavioral health contract vehicles represent quality standards that also function as barriers to entry for models that might produce better outcomes. A proposal for a new institutional architecture faces not just competition from existing providers but a regulatory environment that existing providers have shaped over decades to favor their operational models.</w:t>
-      </w:r>
-    </w:p>
-    <w:p>
-      <w:pPr>
-        <w:pStyle w:val="BodyText"/>
-      </w:pPr>
-      <w:r>
-        <w:t xml:space="preserve">The revenue machine is the name for this dynamic when it operates at the scale of a twenty-four-billion-dollar state program. The machine does not conspire. It does not hold meetings to decide how to perpetuate homelessness. It operates through the cumulative effect of thousands of ordinary institutional decisions, each reasonable in isolation, each reinforcing the conditions that justify the machine’s continued existence. The outreach worker who logs a contact rather than a housing placement is following protocol. The program director who measures shelter bed occupancy rather than housing retention is following the contract’s performance metrics. The county administrator who funds the established provider over the novel model is following procurement policy. No one is lying. No one is breaking rules. The machine produces its output through the aggregate of individually defensible acts.</w:t>
-      </w:r>
-    </w:p>
-    <w:p>
-      <w:pPr>
-        <w:pStyle w:val="BodyText"/>
-      </w:pPr>
-      <w:r>
-        <w:t xml:space="preserve">James Scott’s analysis of high-modernist institutional schemes identifies a related failure mode. Large-scale institutions, Scott argues, systematically fail when they attempt to impose a simplified, legible order on complex local realities whose irreducible detail they cannot perceive or process. The local knowledge that makes a community work, including who watches whose gear, who has a dog named Ranger, and who had a falling out with someone three pods over, is the knowledge that a large institution cannot hold. The institution replaces this knowledge with categories, such as homeless individual, chronically homeless individual, high-acuity client, and non-compliant resident. The categories are operationally necessary and epistemically destructive. They make the institution’s work manageable and the institution’s outcomes predictable, with the result that the person who cannot be reduced to a category falls through the gaps between categories and remains on the street.</w:t>
-      </w:r>
-    </w:p>
-    <w:p>
-      <w:pPr>
-        <w:pStyle w:val="BodyText"/>
-      </w:pPr>
-      <w:r>
-        <w:t xml:space="preserve">The moral question that Arendt’s analysis produces asks what the ethical status is of a person who works within this machine and knows what it is producing. Not the executive who designed the incentive structure and not the politician who allocated the funding, but the caseworker who logs the contact, the shelter director who measures the bed count, and the bureaucrat who writes the compliance report. Arendt’s answer, derived from Eichmann’s case, is that the abdication of moral judgment, representing the choice to follow procedure rather than to think from the perspective of the person the procedure is supposed to serve, is itself a moral act. Thoughtlessness is not a defense. It is the mechanism.</w:t>
-      </w:r>
-    </w:p>
-    <w:p>
-      <w:pPr>
-        <w:pStyle w:val="BodyText"/>
-      </w:pPr>
-      <w:r>
-        <w:t xml:space="preserve">For the people who work in the homelessness services system and are reading this with recognition, this chapter is not an accusation. The individuals within the machine are, with rare exceptions, doing what their institutions reward them for doing, and they entered those institutions because they wanted to help. The indictment is structural. The question is whether structural indictment produces structural change, or whether naming the machine is just another form of moral theater that changes nothing.</w:t>
-      </w:r>
-    </w:p>
-    <w:p>
-      <w:pPr>
-        <w:pStyle w:val="BodyText"/>
-      </w:pPr>
-      <w:r>
-        <w:t xml:space="preserve">The critique that nothing changes no matter what anyone does is historically well-supported and deserves honest engagement rather than optimism. Arendt’s own life did not end in triumph. She documented evil; it continued. But she also observed, across her career, that the moment a machine becomes visible, representing the moment when its mechanism is named and its outputs are traced to their causes, something shifts in the moral environment in which it operates. The machine does not disappear. It becomes harder to pretend that the people within it bear no responsibility for what it produces.</w:t>
-      </w:r>
-    </w:p>
-    <w:p>
-      <w:pPr>
-        <w:pStyle w:val="BodyText"/>
-      </w:pPr>
-      <w:r>
-        <w:t xml:space="preserve">Changing the basis of evaluation is the concrete reform that follows from this analysis. An institution judged by outcomes, meaning housing retention at twenty-four months rather than contacts logged, cannot sustain a business model organized around client persistence. An institution judged by the Finnish benchmark of eighty to ninety percent retention cannot present the American forty percent as a reasonable outcome given available resources. The measurement instrument is a moral instrument. What gets measured determines what gets produced. The machine will not reform itself. But a machine operating under a different measurement regime will produce different outputs, because the institutional behavior it rewards will be different. That is not optimism. It is the same engineering logic that John Snow applied to the Broad Street pump. Find the mechanism. Intervene at the right point. The pump handle, in this case, is the performance metric.</w:t>
-      </w:r>
-      <w:r>
-        <w:t xml:space="preserve"> </w:t>
-      </w:r>
-      <w:r>
-        <w:t xml:space="preserve"># Chapter 10: The Legitimacy of Compelled Care</w:t>
-      </w:r>
-    </w:p>
-    <w:p>
-      <w:pPr>
-        <w:pStyle w:val="BodyText"/>
-      </w:pPr>
-      <w:r>
-        <w:t xml:space="preserve">Thomas Szasz spent fifty years arguing that involuntary psychiatric commitment is the therapeutic state’s primary instrument of social control, that the elastic definition of mental illness has historically expanded to capture political dissidents, social nonconformists, and inconvenient individuals rather than to treat genuine disease, and that the language of care has functioned as a cover for coercion that a free society should not tolerate. He was right about most of this. Anyone who proposes compelled care without first acknowledging what Szasz documented, including the asylum era, the Soviet use of psychiatry as a political weapon, and the racialized application of conservatorship in California’s recent history, is not making an honest argument. This chapter begins with that recognition.</w:t>
-      </w:r>
-    </w:p>
-    <w:p>
-      <w:pPr>
-        <w:pStyle w:val="BodyText"/>
-      </w:pPr>
-      <w:r>
-        <w:t xml:space="preserve">Szasz is right that the therapeutic state expands. He is right that voluntary and involuntary blur within institutions that have incentives to retain clients. He is right that a diagnosis of incapacity has been used to override preferences that were not incapacitated, only inconvenient. The history he cataloged is real and recent enough to be legally actionable in California courts. An argument for compelled care that does not take this history seriously is not an argument that the civil libertarian tradition is obligated to engage. It can be dismissed as naivety dressed as compassion.</w:t>
-      </w:r>
-    </w:p>
-    <w:p>
-      <w:pPr>
-        <w:pStyle w:val="BodyText"/>
-      </w:pPr>
-      <w:r>
-        <w:t xml:space="preserve">Here is the honest argument that takes Szasz seriously and proceeds anyway.</w:t>
-      </w:r>
-    </w:p>
-    <w:p>
-      <w:pPr>
-        <w:pStyle w:val="BodyText"/>
-      </w:pPr>
-      <w:r>
-        <w:t xml:space="preserve">Liberty, in the sense that Mill defined it, representing the right to be left alone and to make choices about one’s own life without interference from others, requires a functioning brain. Not because cognitive performance is the criterion for moral worth. This book’s central claim is the opposite, namely that dignity precedes function, meaning that a person’s claim on moral care is not conditional on the capacity to exercise it. But liberty in Mill’s sense, representing the substantive capacity to guide one’s own life according to personal values and preferences, requires the neurological substrate of deliberation. Without a functioning prefrontal cortex, there is no deliberation occurring. There is reflex, survival response, craving, and threat reaction. These are real experiences. They are not choices in the sense that Mill’s harm principle requires in order to apply.</w:t>
-      </w:r>
-    </w:p>
-    <w:p>
-      <w:pPr>
-        <w:pStyle w:val="BodyText"/>
-      </w:pPr>
-      <w:r>
-        <w:t xml:space="preserve">The person in dorsal-vagal shutdown, which is the physiological state where the nervous system has suspended voluntary activity because the perceived threat is total and inescapable, is not exercising liberty when waving off an outreach worker. Their nervous system is executing a survival reflex that evolved to protect organisms from predators. Stephen Porges’s polyvagal research establishes this mechanism in clinical detail. The practical implication is that</w:t>
-      </w:r>
-      <w:r>
-        <w:t xml:space="preserve"> </w:t>
-      </w:r>
-      <w:r>
-        <w:t xml:space="preserve">“</w:t>
-      </w:r>
-      <w:r>
-        <w:t xml:space="preserve">respecting the refusal</w:t>
-      </w:r>
-      <w:r>
-        <w:t xml:space="preserve">”</w:t>
-      </w:r>
-      <w:r>
-        <w:t xml:space="preserve"> </w:t>
-      </w:r>
-      <w:r>
-        <w:t xml:space="preserve">of a person in shutdown is not a defense of liberty. It is a decision to treat a biological defense response as a considered preference and walk away from someone who cannot advocate for themselves in any meaningful sense at that moment.</w:t>
-      </w:r>
-    </w:p>
-    <w:p>
-      <w:pPr>
-        <w:pStyle w:val="BodyText"/>
-      </w:pPr>
-      <w:r>
-        <w:t xml:space="preserve">Mill wrote for a population of intact rational agents. His harm principle, which asserts that the only legitimate basis for state coercion is preventing harm to others, does not address the population whose capacity for rational agency has been physically destroyed by environmental conditions outside their control. Martha Nussbaum’s capabilities approach provides the model Mill’s does not. Nussbaum argues that a just society has an obligation to bring every person above a threshold of the capabilities required for a human life. Those capabilities include bodily health, practical reason, and the emotional foundations of social engagement. A person below this threshold is not exercising freedom when they remain below it. They are failing to achieve the conditions that freedom requires. Restoring those conditions is not a violation of their autonomy. It is the precondition for their autonomy to exist in a form that matters morally.</w:t>
-      </w:r>
-    </w:p>
-    <w:p>
-      <w:pPr>
-        <w:pStyle w:val="BodyText"/>
-      </w:pPr>
-      <w:r>
-        <w:t xml:space="preserve">Gerald Dworkin’s analysis of autonomy and paternalism establishes the justification for intervention that this argument requires. Dworkin distinguishes between hard and soft paternalism. Hard paternalism overrides the genuine preferences of a competent agent for their own good. Soft paternalism intervenes when the choice being</w:t>
-      </w:r>
-      <w:r>
-        <w:t xml:space="preserve"> </w:t>
-      </w:r>
-      <w:r>
-        <w:t xml:space="preserve">“</w:t>
-      </w:r>
-      <w:r>
-        <w:t xml:space="preserve">respected</w:t>
-      </w:r>
-      <w:r>
-        <w:t xml:space="preserve">”</w:t>
-      </w:r>
-      <w:r>
-        <w:t xml:space="preserve"> </w:t>
-      </w:r>
-      <w:r>
-        <w:t xml:space="preserve">does not reflect the genuine preferences of a competent agent, because the conditions of competence are not present. Compelled care for the person whose prefrontal cortex has been destroyed by street exposure is soft paternalism in Dworkin’s sense. It does not override a genuine choice. It responds to the absence of the conditions under which genuine choice is possible.</w:t>
-      </w:r>
-    </w:p>
-    <w:p>
-      <w:pPr>
-        <w:pStyle w:val="BodyText"/>
-      </w:pPr>
-      <w:r>
-        <w:t xml:space="preserve">The argument requires four conditions to hold simultaneously before compelled intervention is legitimate. All four must be present; the absence of any one defeats the justification. First, the neurological destruction of autonomous agency must be verified through clinical assessment, not asserted by an administrator seeking to manage a difficult client. Second, the finding must be reviewed and authorized under California legal standards, applying the petition structures of CARE Court or the grave disability criteria of Lanterman-Petris-Short conservatorship rules, processed through courts with adequate procedural protections rather than an institutional determination made without adversarial review. Third, the placement must be in the least restrictive environment consistent with clinical need, integrating relational protocols where peer advocates and pod stewards assist the individual. The MDI tower’s Anti-Detention Covenant makes this concrete, guaranteeing that voluntary residents retain unrestricted egress at all times, and involuntary placement converts to voluntary status the moment clinical stabilization permits. Fourth, the intervention must be time-limited and subject to mandatory periodic review, with a defined clinical threshold that triggers transition back to voluntary status.</w:t>
-      </w:r>
-    </w:p>
-    <w:p>
-      <w:pPr>
-        <w:pStyle w:val="BodyText"/>
-      </w:pPr>
-      <w:r>
-        <w:t xml:space="preserve">Szasz defeats unconstrained therapeutic state authority. He does not defeat this four-condition structure. His argument requires a claim of unconditional autonomy that does not survive contact with the clinical reality of a person in dorsal-vagal shutdown. A position that treats every refusal as a valid exercise of liberty regardless of the neurological state of the person refusing is not a defense of liberty. It is a philosophical commitment that kills people by treating their shutdown response as a preference and their survival reflex as a choice.</w:t>
-      </w:r>
-    </w:p>
-    <w:p>
-      <w:pPr>
-        <w:pStyle w:val="BodyText"/>
-      </w:pPr>
-      <w:r>
-        <w:t xml:space="preserve">The harder version of Szasz’s objection is institutional, questioning whether any real institution can be trusted to apply the four-condition structure narrowly rather than using it as a template for expanding its scope. This is the operational risk that the civil libertarian tradition is right to insist on. The answer cannot be philosophical. It must be structural. The Anti-Detention Covenant, which guarantees unrestricted egress for voluntary residents, is a structural guarantee that Process 1 cannot be reclassified as Process 2 by institutional pressure. The Rapid Transition Protocol, where crisis produces transfer rather than eviction, removes the institutional incentive to manage difficult residents through the legal pathway rather than through relational support. These features do not make institutional abuse impossible. Nothing does. They close doors through which abuse has historically entered, and they are the minimum structural preconditions for any institution operating a legal access pathway to claim that it is applying the pathway as intended.</w:t>
-      </w:r>
-    </w:p>
-    <w:p>
-      <w:pPr>
-        <w:pStyle w:val="BodyText"/>
-      </w:pPr>
-      <w:r>
-        <w:t xml:space="preserve">The argument for compelled care does not require confidence in institutions. It requires only recognition that the alternative, including leaving a person in total neurological shutdown on the street in deference to a refusal they did not cognitively generate because the institution that might intervene cannot be trusted, is a choice with consequences. Those consequences arrive on the pavement, at night, in winter, and they are as concrete as any choice the institution might make. Inaction is an action. The question is not whether we intervene but which intervention we choose, and on what grounds. The grounds this book offers are biological, constrained, procedurally protected, and reversible. They are not sufficient to trust any particular institution. They are sufficient to establish that compelled care, under these conditions, is a moral obligation rather than a moral violation.</w:t>
-      </w:r>
-      <w:r>
-        <w:t xml:space="preserve"> </w:t>
-      </w:r>
-      <w:r>
-        <w:t xml:space="preserve"># Chapter 11: John Snow and the Moral Physicist</w:t>
-      </w:r>
-    </w:p>
-    <w:p>
-      <w:pPr>
-        <w:pStyle w:val="BodyText"/>
-      </w:pPr>
-      <w:r>
-        <w:t xml:space="preserve">In the summer of 1854, Soho was dying. The Broad Street cholera outbreak killed more than six hundred people in ten days, representing one of the highest mortality rates the city had recorded. The prevailing theory attributed cholera to miasma, which was defined as foul air rising from the soil and refuse of densely populated neighborhoods. Physicians recommended improved ventilation. Ministers recommended prayer. City officials debated sanitary reform. The deaths continued.</w:t>
-      </w:r>
-    </w:p>
-    <w:p>
-      <w:pPr>
-        <w:pStyle w:val="BodyText"/>
-      </w:pPr>
-      <w:r>
-        <w:t xml:space="preserve">John Snow did not accept the miasma theory. He had been skeptical of it for years, on the grounds that it could not account for the distinct patterns of infection he had observed in prior outbreaks. Miasma should affect everyone in a given neighborhood roughly equally. The distribution of cholera deaths was not equal. It was clustered. Several streets had many deaths; adjacent streets had almost none. This clustering was a pattern that the miasma theory could not explain, and Snow was the kind of mind that treated unexplained patterns as evidence against their explaining theory rather than as noise to be dismissed.</w:t>
-      </w:r>
-    </w:p>
-    <w:p>
-      <w:pPr>
-        <w:pStyle w:val="BodyText"/>
-      </w:pPr>
-      <w:r>
-        <w:t xml:space="preserve">He began mapping. He recorded each death by its home address, plotted the addresses on a street map of Soho, and looked at the result. The deaths clustered around a single point, namely the public water pump on Broad Street. This observation was not itself conclusive, since the residents of the surrounding streets all used the same pump, meaning proximity to the pump established correlation rather than causation. Snow went further. He interviewed survivors and neighbors to understand who had drunk from the Broad Street pump and who had used other water sources. The brewery workers on Broad Street, who drank beer rather than water, had no deaths. The workhouse residents nearby, who had their own internal pump, had almost no deaths despite being in the center of the outbreak zone. The pattern was consistent across every data point Snow could collect.</w:t>
-      </w:r>
-    </w:p>
-    <w:p>
-      <w:pPr>
-        <w:pStyle w:val="BodyText"/>
-      </w:pPr>
-      <w:r>
-        <w:t xml:space="preserve">He then identified the causal mechanism. The Broad Street pump drew from a well that had been contaminated by a cesspit leaking into the groundwater nearby. The cholera, whatever cholera was, since the germ theory of disease was not yet established, was in the water. The pump was delivering contaminated water to hundreds of people every day, and the deaths were the output of that delivery.</w:t>
-      </w:r>
-    </w:p>
-    <w:p>
-      <w:pPr>
-        <w:pStyle w:val="BodyText"/>
-      </w:pPr>
-      <w:r>
-        <w:t xml:space="preserve">Snow went to the Board of Guardians and asked them to remove the handle from the Broad Street pump. They agreed, reluctantly and skeptically. He removed the handle. The outbreak collapsed within days.</w:t>
-      </w:r>
-    </w:p>
-    <w:p>
-      <w:pPr>
-        <w:pStyle w:val="BodyText"/>
-      </w:pPr>
-      <w:r>
-        <w:t xml:space="preserve">The sequence of Snow’s method is what makes it instructive as a model for this book. He did not begin with a theory. He began with a pattern, representing a cluster of deaths that the prevailing explanation could not account for. He mapped the pattern at the level of particular individuals and distinct locations, not at the level of aggregate statistics. He identified a mechanism that could explain the pattern, namely a physical pathway through which something was being delivered that caused the observed harm. He intervened at the mechanism, physically on the causal node, rather than lobbying for general sanitary reform or publishing a paper arguing for the germ theory. The intervention was local and immediate. The effect was local and immediate.</w:t>
-      </w:r>
-    </w:p>
-    <w:p>
-      <w:pPr>
-        <w:pStyle w:val="BodyText"/>
-      </w:pPr>
-      <w:r>
-        <w:t xml:space="preserve">The moral physicist is the person who applies this sequence to human suffering rather than to disease. The steps are the same. Identify the pattern that the prevailing explanation does not account for, which is the unsheltered individuals who repeatedly refuse services that the system categorizes as adequate, generating a pattern of failure that the system attributes to the population’s pathology rather than to its own design. Map the pattern at the level of distinct mechanisms, including the neurological destruction of autonomous agency, the institutional classification of defense reflexes as behavioral choices, and the hierarchy inversion that demands performance as a condition of receiving the conditions that make performance possible. Identify the causal node, whereby the warm offer delivered to a person in dorsal-vagal shutdown is an offer delivered to a nervous system that cannot receive it. The pump handle, representing the physical intervention point, is the moment of contact between the outreach worker and the individual, and the manner of that contact determines whether it activates threat response or social engagement.</w:t>
-      </w:r>
-    </w:p>
-    <w:p>
-      <w:pPr>
-        <w:pStyle w:val="BodyText"/>
-      </w:pPr>
-      <w:r>
-        <w:t xml:space="preserve">Remove the pump handle by changing the manner of contact. Train the worker to identify autonomic state. Change the script. Change the approach vector. Change the institutional recording practice that converts a non-response into a refusal. These are physical interventions on a causal chain, not policy positions or advocacy campaigns. They produce observable outcomes in distinct individuals, measurable within ninety days at the level of named contacts, voluntary engagement rates, and housing retention.</w:t>
-      </w:r>
-    </w:p>
-    <w:p>
-      <w:pPr>
-        <w:pStyle w:val="BodyText"/>
-      </w:pPr>
-      <w:r>
-        <w:t xml:space="preserve">Snow did not debate the miasma theory with its defenders. He did not write a policy paper arguing that sanitary reform was necessary. He did not wait for the Board of Guardians to adopt the germ theory before acting. He identified the mechanism, intervened at the causal node, and the deaths stopped. His vindication came from the outcome, not from the debate. The moral physicist’s vindication comes from the same place, namely that the person who was on the dirt is now inside, sleeping, and in six months will be attending the pod council and in twelve months will be considering vocational training. The pump handle is removed. The mechanism has been interrupted. The outcome is the argument.</w:t>
-      </w:r>
-      <w:r>
-        <w:t xml:space="preserve"> </w:t>
-      </w:r>
-      <w:r>
-        <w:t xml:space="preserve"># Chapter 12: The Remnant and the Obligation</w:t>
-      </w:r>
-    </w:p>
-    <w:p>
-      <w:pPr>
-        <w:pStyle w:val="BodyText"/>
-      </w:pPr>
-      <w:r>
-        <w:t xml:space="preserve">Václav Havel wrote</w:t>
+        <w:t xml:space="preserve">The answer, derived from the stress neurobiology that Robert Sapolsky and Bruce McEwen established, is acoustic sanctuary, private space with a locking door, reliable metabolic provision, and uninterrupted sleep across a decompression period long enough for cortisol levels to normalize. Ninety days, as a conservative estimate. No compliance requirement. No behavioral test. The biological floor is established by meeting biological conditions. It cannot be established by offering services contingent on behavioral readiness, because behavioral readiness is what establishing the biological floor produces.</w:t>
+      </w:r>
+    </w:p>
+    <w:p>
+      <w:pPr>
+        <w:pStyle w:val="BodyText"/>
+      </w:pPr>
+      <w:r>
+        <w:t xml:space="preserve">The second institutional question, which becomes available only after the first has been answered, is what the relational environment within the space needs to contain for the biological stabilization to convert into human recovery rather than survival at a different location. The Finnish answer to this question achieved eighty to ninety percent two-year housing retention. The American answer achieved below forty percent. The difference is not money, though Finland spent more. The difference is the deliberate design of the relational layer, comprising the housing advisor role that holds individual histories, the community scale that permits genuine recognition, and the daily rhythms that restore ontological security. These are engineering specifications, not aspirations. They can be replicated by any system that decides to design for them.</w:t>
+      </w:r>
+    </w:p>
+    <w:p>
+      <w:pPr>
+        <w:pStyle w:val="BodyText"/>
+      </w:pPr>
+      <w:r>
+        <w:t xml:space="preserve">This operational sequence is reflected in the pro forma model of the One California Plaza prototype. The acquisition and conversion require a total capitalization of two hundred twenty million dollars, structured with one hundred thirty-two million dollars in senior concessionary debt and eighty-eight million dollars in catalytic first-loss equity. Operating expenses at maturity stand at twenty million seven hundred forty-eight thousand dollars, funded by stabilized CalAIM billing lines averaging eighteen thousand two hundred dollars per unit annually. This yields a net operating income of thirteen million eight hundred thirty-two thousand dollars, covering senior debt service at one point three one times and generating a nominal return of three point seven percent on catalytic equity. The prototype achieves ninety-five million dollars in gross annual avoided public costs, illustrating that biological stabilization is a viable fiscal investment.</w:t>
+      </w:r>
+    </w:p>
+    <w:p>
+      <w:pPr>
+        <w:pStyle w:val="BodyText"/>
+      </w:pPr>
+      <w:r>
+        <w:t xml:space="preserve">The third institutional question, available only after the first two have been answered, is what forward pathways the person needs to rebuild the identity capital that the street destroyed. Employment that does not require competitive-market readiness before income becomes accessible. Educational access that does not require a fixed address for enrollment. Community governance that positions the resident as a citizen rather than a client. Each of these is a designed institutional feature, not a natural outcome of providing housing.</w:t>
+      </w:r>
+    </w:p>
+    <w:p>
+      <w:pPr>
+        <w:pStyle w:val="BodyText"/>
+      </w:pPr>
+      <w:r>
+        <w:t xml:space="preserve">This sequence, progressing from the biological floor to relational recovery and then to identity reconstruction, is the opposite of the sequence the existing system uses. The existing system demands proof of stability before offering the conditions that would produce stability. It requires compliance before providing the environment in which compliance becomes possible. It measures retention without designing for the relational conditions that drive retention. James Scott would recognize this pattern immediately. In Seeing Like a State, Scott documents how high-modernist institutional schemes consistently fail because they attempt to impose a legible, standardized order on complex social realities whose local detail they cannot perceive. The existing homelessness system is a textbook Scott failure, operating through categories that cannot hold the particular person, through processes that cannot retain the local knowledge that would make those processes work, and through metrics that measure institutional activity rather than human outcome.</w:t>
+      </w:r>
+    </w:p>
+    <w:p>
+      <w:pPr>
+        <w:pStyle w:val="BodyText"/>
+      </w:pPr>
+      <w:r>
+        <w:t xml:space="preserve">Starting from the correct philosophy would also have produced a different relationship to the question of compelled care. The existing system lurches between two positions that are both inadequate, representing pure autonomy, in which any refusal is treated as valid regardless of the neurological state of the person refusing, and pure institutionalism, in which court-ordered placement is processed through the same apparatus that produced the revenue machine. The correct philosophy produces a third position, whereby compelled care is legitimate under four particular conjunctive conditions, is illegitimate when any one of those conditions is absent, and is surrounded by structural guarantees that prevent the legitimate pathway from expanding into the illegitimate one. Getting to this position required the philosophical work of Chapter 10. Without that work, the policy debate oscillates between advocates who will not acknowledge that some people cannot exercise autonomous choice and libertarians who will not acknowledge that inaction is a choice. The philosophy resolves this oscillation by delineating the conditions under which each position applies.</w:t>
+      </w:r>
+    </w:p>
+    <w:p>
+      <w:pPr>
+        <w:pStyle w:val="BodyText"/>
+      </w:pPr>
+      <w:r>
+        <w:t xml:space="preserve">The pessimist reading this is right to ask whether any of this matters. Václav Havel wrote</w:t>
       </w:r>
       <w:r>
         <w:t xml:space="preserve"> </w:t>
@@ -1550,263 +1607,6 @@
         <w:t xml:space="preserve"> </w:t>
       </w:r>
       <w:r>
-        <w:t xml:space="preserve">in 1978, in a Czechoslovakia under Soviet normalization, at a moment when every public institution had been occupied by the apparatus of a system that required everyone within it to perform compliance with an official reality that everyone knew was false. The greengrocer puts up the sign,</w:t>
-      </w:r>
-      <w:r>
-        <w:t xml:space="preserve"> </w:t>
-      </w:r>
-      <w:r>
-        <w:t xml:space="preserve">“</w:t>
-      </w:r>
-      <w:r>
-        <w:t xml:space="preserve">Workers of the World, Unite!</w:t>
-      </w:r>
-      <w:r>
-        <w:t xml:space="preserve">”</w:t>
-      </w:r>
-      <w:r>
-        <w:t xml:space="preserve">, not because he believes it but because not putting it up would expose him to consequences. The sign is not communication. It is a ritual of participation in a collective lie that keeps the system operational. The system survives, Havel argued, not through sincere belief but through the accumulated weight of everyone’s individual decisions to perform compliance rather than to live in truth.</w:t>
-      </w:r>
-    </w:p>
-    <w:p>
-      <w:pPr>
-        <w:pStyle w:val="BodyText"/>
-      </w:pPr>
-      <w:r>
-        <w:t xml:space="preserve">The power of the powerless, as Havel understood it, lies in the refusal to perform. When the greengrocer takes down the sign, acting as though the official reality is not real, he does something that the system has no protocol for. He becomes a person who has stepped outside the system’s logic, and by doing so reveals that the system’s logic depends on everyone’s participation to sustain it. The act is tiny. Its significance is not in its immediate effect but in what it demonstrates, namely that the system’s apparent inevitability is not inevitability at all. It is the sum of individual choices to comply.</w:t>
-      </w:r>
-    </w:p>
-    <w:p>
-      <w:pPr>
-        <w:pStyle w:val="BodyText"/>
-      </w:pPr>
-      <w:r>
-        <w:t xml:space="preserve">MacIntyre, writing</w:t>
-      </w:r>
-      <w:r>
-        <w:t xml:space="preserve"> </w:t>
-      </w:r>
-      <w:r>
-        <w:rPr>
-          <w:iCs/>
-          <w:i/>
-        </w:rPr>
-        <w:t xml:space="preserve">After Virtue</w:t>
-      </w:r>
-      <w:r>
-        <w:t xml:space="preserve"> </w:t>
-      </w:r>
-      <w:r>
-        <w:t xml:space="preserve">in 1981, describes the same dynamic from a different historical vantage. When moral traditions collapse, meaning when the institutions that embodied and transmitted those traditions are corrupted or destroyed, what survives is the remnant, representing the people who continue to practice the virtues of the tradition in small communities, outside the dominant institutional structure, keeping the intellectual and moral forms alive through the period of darkness. MacIntyre ends</w:t>
-      </w:r>
-      <w:r>
-        <w:t xml:space="preserve"> </w:t>
-      </w:r>
-      <w:r>
-        <w:rPr>
-          <w:iCs/>
-          <w:i/>
-        </w:rPr>
-        <w:t xml:space="preserve">After Virtue</w:t>
-      </w:r>
-      <w:r>
-        <w:t xml:space="preserve"> </w:t>
-      </w:r>
-      <w:r>
-        <w:t xml:space="preserve">with a famous sentence, noting that we are waiting not for a Godot, but for another, doubtless very different, St. Benedict. He is waiting for the person who will build the new communities that carry the tradition through to the next period when it can be rebuilt at scale.</w:t>
-      </w:r>
-    </w:p>
-    <w:p>
-      <w:pPr>
-        <w:pStyle w:val="BodyText"/>
-      </w:pPr>
-      <w:r>
-        <w:t xml:space="preserve">The remnant in this book is not a religious category. It is a functional one. The remnant consists of the people who refuse to look away from what the street is doing to Arthur, maintaining the accurate account, as Havel put it, in the face of a system that requires performance of a different account. The system’s account says that Arthur declined services, that he is a non-compliant refuser, and that the system acted appropriately. The accurate account says that Arthur’s nervous system was in dorsal-vagal shutdown, that his autonomic state was misread as a behavioral choice, and that the system recorded a category error as an outcome and drove away. These two accounts are not minor variations. They are incompatible descriptions of the same event, with incompatible moral implications.</w:t>
-      </w:r>
-    </w:p>
-    <w:p>
-      <w:pPr>
-        <w:pStyle w:val="BodyText"/>
-      </w:pPr>
-      <w:r>
-        <w:t xml:space="preserve">The remnant carries the accurate account during the period when institutions will not. This function is not dramatic. It consists mostly of showing up, repeatedly, to the same location, at the same time, with the same offering, and asking the same question, namely if the individual needs anything. It consists of learning someone’s name and using it. Remembering what they asked for last week. Returning with what you promised. Writing things down accurately and reporting what you saw rather than what the form asks for. These acts are small. Their cumulative effect is the slow accumulation of a body of witness, representing an evidentiary record of what is happening to particular people in distinct locations, that becomes available to act on when the political window opens.</w:t>
-      </w:r>
-    </w:p>
-    <w:p>
-      <w:pPr>
-        <w:pStyle w:val="BodyText"/>
-      </w:pPr>
-      <w:r>
-        <w:t xml:space="preserve">The obligation created by witnessing is not delegable. This is the point on which the remnant’s moral position differs from that of the advocate or the reformer. An advocate can represent the interests of a population they have never met. A reformer can design policy for people they have only encountered in data. The witness has seen the particular person. The witness knows Arthur’s face and the way he holds his plastic crate and the fact that he has not eaten today and the fact that his cough has gotten worse. This individual knowledge generates an obligation that cannot be transferred to an institution or a program or a grant application. The institution can process Arthur. Only the witness knows Arthur.</w:t>
-      </w:r>
-    </w:p>
-    <w:p>
-      <w:pPr>
-        <w:pStyle w:val="BodyText"/>
-      </w:pPr>
-      <w:r>
-        <w:t xml:space="preserve">Havel did not survive the Soviet period because he was powerful. He survived because he maintained the accurate account at enormous personal cost, through imprisonment and harassment and the suppression of his work, and when the system collapsed, which it did within eleven years of</w:t>
-      </w:r>
-      <w:r>
-        <w:t xml:space="preserve"> </w:t>
-      </w:r>
-      <w:r>
-        <w:rPr>
-          <w:iCs/>
-          <w:i/>
-        </w:rPr>
-        <w:t xml:space="preserve">The Power of the Powerless</w:t>
-      </w:r>
-      <w:r>
-        <w:t xml:space="preserve"> </w:t>
-      </w:r>
-      <w:r>
-        <w:t xml:space="preserve">being circulated in samizdat, he was the person who was ready, having the moral clarity and the sustained witness of what the system had done, to act in the political window that opened. The remnant’s function is to be that person, in that moment, for the people on the street.</w:t>
-      </w:r>
-    </w:p>
-    <w:p>
-      <w:pPr>
-        <w:pStyle w:val="BodyText"/>
-      </w:pPr>
-      <w:r>
-        <w:t xml:space="preserve">The obligation does not promise that the window will come soon. It does not promise that the remnant’s witnessing will produce the system change that Arthur needs. What it promises is that the accurate account will exist, maintained by dedicated people who refused to look away, and that when the political conditions change, which they will because the conditions that produce chronic mass homelessness at this scale are not stable, there will be people who know what to build, because they have been watching the mechanism for long enough to understand where the pump handle is.</w:t>
-      </w:r>
-      <w:r>
-        <w:t xml:space="preserve"> </w:t>
-      </w:r>
-      <w:r>
-        <w:t xml:space="preserve"># Chapter 13: A Different Starting Point</w:t>
-      </w:r>
-    </w:p>
-    <w:p>
-      <w:pPr>
-        <w:pStyle w:val="BodyText"/>
-      </w:pPr>
-      <w:r>
-        <w:t xml:space="preserve">What would we have built if we had started with the right philosophy?</w:t>
-      </w:r>
-    </w:p>
-    <w:p>
-      <w:pPr>
-        <w:pStyle w:val="BodyText"/>
-      </w:pPr>
-      <w:r>
-        <w:t xml:space="preserve">This is not a rhetorical question. Philosophy has operational consequences. The conceptual tools a society uses to understand what a person is determine what it builds to address human need. Get the philosophy wrong and you build the wrong system, measure the wrong things, fund the wrong institutions, and produce the wrong outcomes while maintaining confidence in the correctness of your approach. California spent twenty-four billion dollars with confidence. The philosophy was wrong from the beginning.</w:t>
-      </w:r>
-    </w:p>
-    <w:p>
-      <w:pPr>
-        <w:pStyle w:val="BodyText"/>
-      </w:pPr>
-      <w:r>
-        <w:t xml:space="preserve">The correct starting point is the biological floor. Before any theory of rights, before any structure of justice, before any question about what individuals owe each other or what institutions owe individuals, there is the physical fact of a human body that requires particular conditions to remain capable of anything else. Sleep, food, temperature regulation, acoustic protection, and the neurological decompression that only follows when these needs are reliably met are not policy preferences. They are the preconditions for everything the social contract assumes the individual can do. A rights structure that does not establish the biological floor first is built on an assumption about the person it is reasoning about that the chronically unsheltered population defeats by existing.</w:t>
-      </w:r>
-    </w:p>
-    <w:p>
-      <w:pPr>
-        <w:pStyle w:val="BodyText"/>
-      </w:pPr>
-      <w:r>
-        <w:t xml:space="preserve">Starting from the biological floor produces a different architecture. The first institutional question is not</w:t>
-      </w:r>
-      <w:r>
-        <w:t xml:space="preserve"> </w:t>
-      </w:r>
-      <w:r>
-        <w:t xml:space="preserve">“</w:t>
-      </w:r>
-      <w:r>
-        <w:t xml:space="preserve">what services does this person need?</w:t>
-      </w:r>
-      <w:r>
-        <w:t xml:space="preserve">”</w:t>
-      </w:r>
-      <w:r>
-        <w:t xml:space="preserve"> </w:t>
-      </w:r>
-      <w:r>
-        <w:t xml:space="preserve">but</w:t>
-      </w:r>
-      <w:r>
-        <w:t xml:space="preserve"> </w:t>
-      </w:r>
-      <w:r>
-        <w:t xml:space="preserve">“</w:t>
-      </w:r>
-      <w:r>
-        <w:t xml:space="preserve">what does this person’s nervous system require before they can use any service?</w:t>
-      </w:r>
-      <w:r>
-        <w:t xml:space="preserve">”</w:t>
-      </w:r>
-      <w:r>
-        <w:t xml:space="preserve"> </w:t>
-      </w:r>
-      <w:r>
-        <w:t xml:space="preserve">The answer, derived from the stress neurobiology that Robert Sapolsky and Bruce McEwen established, is acoustic sanctuary, private space with a locking door, reliable metabolic provision, and uninterrupted sleep across a decompression period long enough for cortisol levels to normalize. Ninety days, as a conservative estimate. No compliance requirement. No behavioral test. The biological floor is established by meeting biological conditions. It cannot be established by offering services contingent on behavioral readiness, because behavioral readiness is what establishing the biological floor produces.</w:t>
-      </w:r>
-    </w:p>
-    <w:p>
-      <w:pPr>
-        <w:pStyle w:val="BodyText"/>
-      </w:pPr>
-      <w:r>
-        <w:t xml:space="preserve">The second institutional question, which becomes available only after the first has been answered, is what the relational environment within the space needs to contain for the biological stabilization to convert into human recovery rather than survival at a different location. The Finnish answer to this question achieved eighty to ninety percent two-year housing retention. The American answer achieved below forty percent. The difference is not money, though Finland spent more. The difference is the deliberate design of the relational layer, comprising the housing advisor role that holds individual histories, the community scale that permits genuine recognition, and the daily rhythms that restore ontological security. These are engineering specifications, not aspirations. They can be replicated by any system that decides to design for them.</w:t>
-      </w:r>
-    </w:p>
-    <w:p>
-      <w:pPr>
-        <w:pStyle w:val="BodyText"/>
-      </w:pPr>
-      <w:r>
-        <w:t xml:space="preserve">This operational sequence is reflected in the pro forma model of the One California Plaza prototype. The acquisition and conversion require a total capitalization of two hundred twenty million dollars, structured with one hundred thirty-two million dollars in senior concessionary debt and eighty-eight million dollars in catalytic first-loss equity. Operating expenses at maturity stand at twenty million seven hundred forty-eight thousand dollars, funded by stabilized CalAIM billing lines averaging eighteen thousand two hundred dollars per unit annually. This yields a net operating income of thirteen million eight hundred thirty-two thousand dollars, covering senior debt service at one point three one times and generating a nominal return of three point seven percent on catalytic equity. The prototype achieves ninety-five million dollars in gross annual avoided public costs, illustrating that biological stabilization is a viable fiscal investment.</w:t>
-      </w:r>
-    </w:p>
-    <w:p>
-      <w:pPr>
-        <w:pStyle w:val="BodyText"/>
-      </w:pPr>
-      <w:r>
-        <w:t xml:space="preserve">The third institutional question, available only after the first two have been answered, is what forward pathways the person needs to rebuild the identity capital that the street destroyed. Employment that does not require competitive-market readiness before income becomes accessible. Educational access that does not require a fixed address for enrollment. Community governance that positions the resident as a citizen rather than a client. Each of these is a designed institutional feature, not a natural outcome of providing housing.</w:t>
-      </w:r>
-    </w:p>
-    <w:p>
-      <w:pPr>
-        <w:pStyle w:val="BodyText"/>
-      </w:pPr>
-      <w:r>
-        <w:t xml:space="preserve">This sequence, progressing from the biological floor to relational recovery and then to identity reconstruction, is the opposite of the sequence the existing system uses. The existing system demands proof of stability before offering the conditions that would produce stability. It requires compliance before providing the environment in which compliance becomes possible. It measures retention without designing for the relational conditions that drive retention. James Scott would recognize this pattern immediately. In Seeing Like a State, Scott documents how high-modernist institutional schemes consistently fail because they attempt to impose a legible, standardized order on complex social realities whose local detail they cannot perceive. The existing homelessness system is a textbook Scott failure, operating through categories that cannot hold the particular person, through processes that cannot retain the local knowledge that would make those processes work, and through metrics that measure institutional activity rather than human outcome.</w:t>
-      </w:r>
-    </w:p>
-    <w:p>
-      <w:pPr>
-        <w:pStyle w:val="BodyText"/>
-      </w:pPr>
-      <w:r>
-        <w:t xml:space="preserve">Starting from the correct philosophy would also have produced a different relationship to the question of compelled care. The existing system lurches between two positions that are both inadequate, representing pure autonomy, in which any refusal is treated as valid regardless of the neurological state of the person refusing, and pure institutionalism, in which court-ordered placement is processed through the same apparatus that produced the revenue machine. The correct philosophy produces a third position, whereby compelled care is legitimate under four particular conjunctive conditions, is illegitimate when any one of those conditions is absent, and is surrounded by structural guarantees that prevent the legitimate pathway from expanding into the illegitimate one. Getting to this position required the philosophical work of Chapter 10. Without that work, the policy debate oscillates between advocates who will not acknowledge that some people cannot exercise autonomous choice and libertarians who will not acknowledge that inaction is a choice. The philosophy resolves this oscillation by delineating the conditions under which each position applies.</w:t>
-      </w:r>
-    </w:p>
-    <w:p>
-      <w:pPr>
-        <w:pStyle w:val="BodyText"/>
-      </w:pPr>
-      <w:r>
-        <w:t xml:space="preserve">The pessimist reading this is right to ask whether any of this matters. Václav Havel wrote</w:t>
-      </w:r>
-      <w:r>
-        <w:t xml:space="preserve"> </w:t>
-      </w:r>
-      <w:r>
-        <w:rPr>
-          <w:iCs/>
-          <w:i/>
-        </w:rPr>
-        <w:t xml:space="preserve">The Power of the Powerless</w:t>
-      </w:r>
-      <w:r>
-        <w:t xml:space="preserve"> </w:t>
-      </w:r>
-      <w:r>
         <w:t xml:space="preserve">under conditions of total institutional capture, in a state where the distance between the correct philosophy and the operating reality was so extreme that articulating the correct philosophy was a criminal act. His argument was not that the correct philosophy would immediately change the system. His argument was that living in the truth, representing the maintenance of the accurate account of what is happening, and refusing to perform compliance with an official reality that everyone knows is false, is its own form of action, and that it changes the moral environment in which the system operates even when it does not change the system immediately.</w:t>
       </w:r>
     </w:p>
@@ -1832,6 +1632,68 @@
       </w:pPr>
       <w:r>
         <w:t xml:space="preserve">John Snow removed the pump handle. The cholera deaths that occurred after he identified the mechanism and before he acted are the measure of what getting the diagnosis right is worth. Getting there faster, understanding the mechanism earlier, and designing the intervention before the epidemic rather than during it represent the consequences of starting from the correct philosophy. Not certainty. Not triumph. The capacity to act correctly when the moment arrives. That capacity is what this book is for.</w:t>
+      </w:r>
+      <w:r>
+        <w:t xml:space="preserve"> </w:t>
+      </w:r>
+      <w:r>
+        <w:t xml:space="preserve"># Epilogue: The Pump Handle</w:t>
+      </w:r>
+    </w:p>
+    <w:p>
+      <w:pPr>
+        <w:pStyle w:val="BodyText"/>
+      </w:pPr>
+      <w:r>
+        <w:t xml:space="preserve">During the cholera outbreak of 1854, the Board of Health debated the miasma theory of disease while thousands of residents died from drinking contaminated water. Dr. John Snow faced a bureaucratic consensus demanding systemic reform of the London sewer infrastructure before enacting any public health intervention. Bypassing the procedural delays, Snow identified the source of the biological threat and dismantled the water pump at Broad Street. He removed the physical vector of transmission. The epidemic ended.</w:t>
+      </w:r>
+    </w:p>
+    <w:p>
+      <w:pPr>
+        <w:pStyle w:val="BodyText"/>
+      </w:pPr>
+      <w:r>
+        <w:t xml:space="preserve">Today, municipal governments mirror the Board of Health. Elected officials construct multi-year legislative strategies to address the housing crisis while leaving vulnerable populations exposed to terminal street conditions. Rebuilding the psychiatric care infrastructure and financing new housing developments require decades of political alignment. During this delay, the physical environment of the street dismantles the human nervous system. Brains die on the pavement.</w:t>
+      </w:r>
+    </w:p>
+    <w:p>
+      <w:pPr>
+        <w:pStyle w:val="BodyText"/>
+      </w:pPr>
+      <w:r>
+        <w:t xml:space="preserve">The immediate threat demands a mechanical intervention. Phase Zero stabilization requires moving bodies inside behind locked doors to arrest the biological collapse. We must establish the physical floor before attempting to rebuild the social contract. A drowning person requires extraction from the water rather than a debate over maritime safety regulations. Rescue is a physical act.</w:t>
+      </w:r>
+    </w:p>
+    <w:p>
+      <w:pPr>
+        <w:pStyle w:val="BodyText"/>
+      </w:pPr>
+      <w:r>
+        <w:t xml:space="preserve">Courage manifests in observable actions. A clinician violates a discharge protocol to keep a patient stabilized in a warm bed. A street outreach worker bypasses a chronological waitlist to place a freezing individual in immediate shelter. These actions invite professional hazard by breaking administrative rules to protect human biology. When institutional compliance guarantees injury, violating procedure becomes a moral imperative. Disobedience saves lives.</w:t>
+      </w:r>
+    </w:p>
+    <w:p>
+      <w:pPr>
+        <w:pStyle w:val="BodyText"/>
+      </w:pPr>
+      <w:r>
+        <w:t xml:space="preserve">The rules that govern urban housing delivery rationalize the abandonment of the vulnerable. Procedural delays force a zero-sum choice between preserving administrative order and sustaining human life. The ethical path requires choosing survival.</w:t>
+      </w:r>
+    </w:p>
+    <w:p>
+      <w:pPr>
+        <w:pStyle w:val="BodyText"/>
+      </w:pPr>
+      <w:r>
+        <w:t xml:space="preserve">While policymakers construct ten-year timelines for structural change, Arthur sleeps on freezing concrete tonight. Establishing the physical floor constitutes a moral necessity. Biological survival functions as the precondition for personhood. Without a stable physical substrate, human rights exist only as theoretical abstractions. Environmental exposure destroys the cognitive capacity required to exercise agency. Defending the physical body operates as the primary civic duty. All other moral claims depend upon the survival of the organism.</w:t>
+      </w:r>
+    </w:p>
+    <w:p>
+      <w:pPr>
+        <w:pStyle w:val="BodyText"/>
+      </w:pPr>
+      <w:r>
+        <w:t xml:space="preserve">This structural model relies on biological physics rather than political ideology. To rescue the person, society must first stabilize the organism. To honor the social contract, institutions must protect the physiological foundation of the population. Vulnerability creates the moral obligation to intervene. Dignity arises from the human form rather than cognitive performance. This reality establishes a secular foundation for action. The evidence dictates the response. Remove the handle.</w:t>
       </w:r>
       <w:r>
         <w:t xml:space="preserve"> </w:t>

</xml_diff>